<commit_message>
feat: add Lesson 1 Health curriculum resources and automate lesson plan document generation
</commit_message>
<xml_diff>
--- a/Units/Health/Term 3 Be active/Lesson 1 - Lesson Plan.docx
+++ b/Units/Health/Term 3 Be active/Lesson 1 - Lesson Plan.docx
@@ -4,63 +4,380 @@
   <w:body>
     <w:p>
       <w:pPr>
-        <w:jc w:val="center"/>
+        <w:spacing w:after="80"/>
       </w:pPr>
       <w:r>
         <w:rPr>
+          <w:rFonts w:ascii="Calibri" w:hAnsi="Calibri"/>
           <w:b/>
-          <w:sz w:val="28"/>
+          <w:i w:val="0"/>
+          <w:color w:val="C77D18"/>
+          <w:sz w:val="18"/>
         </w:rPr>
-        <w:t>LESSON PLAN</w:t>
+        <w:t>WEEK 1 | TOPIC 1: VALUING DIVERSITY</w:t>
       </w:r>
     </w:p>
     <w:p>
       <w:pPr>
-        <w:jc w:val="center"/>
+        <w:pStyle w:val="Title"/>
+        <w:spacing w:after="80"/>
       </w:pPr>
       <w:r>
         <w:rPr>
+          <w:rFonts w:ascii="Calibri" w:hAnsi="Calibri"/>
           <w:b/>
-          <w:sz w:val="28"/>
+          <w:i w:val="0"/>
+          <w:color w:val="17324D"/>
+          <w:sz w:val="54"/>
         </w:rPr>
-        <w:t>Let's All Be Active — Lesson 1</w:t>
+        <w:t>My activity, our community</w:t>
       </w:r>
     </w:p>
-    <w:p/>
+    <w:p>
+      <w:pPr>
+        <w:pStyle w:val="Subtitle"/>
+      </w:pPr>
+      <w:r>
+        <w:rPr>
+          <w:rFonts w:ascii="Calibri" w:hAnsi="Calibri"/>
+          <w:b w:val="0"/>
+          <w:i w:val="0"/>
+          <w:color w:val="52606D"/>
+          <w:sz w:val="26"/>
+        </w:rPr>
+        <w:t>A 60-minute lesson in which students use personal and cultural activity evidence to explain how valuing diversity can strengthen community wellbeing.</w:t>
+      </w:r>
+    </w:p>
     <w:tbl>
       <w:tblPr>
-        <w:tblStyle w:val="TableGrid"/>
-        <w:tblW w:type="auto" w:w="0"/>
+        <w:tblW w:type="dxa" w:w="9360"/>
+        <w:jc w:val="center"/>
+        <w:tblLayout w:type="fixed"/>
         <w:tblLook w:firstColumn="1" w:firstRow="1" w:lastColumn="0" w:lastRow="0" w:noHBand="0" w:noVBand="1" w:val="04A0"/>
+        <w:tblInd w:w="120" w:type="dxa"/>
+        <w:tblBorders>
+          <w:top w:val="single" w:sz="8" w:color="007C83"/>
+          <w:left w:val="single" w:sz="8" w:color="007C83"/>
+          <w:bottom w:val="single" w:sz="8" w:color="007C83"/>
+          <w:right w:val="single" w:sz="8" w:color="007C83"/>
+          <w:insideH w:val="single" w:sz="8" w:color="007C83"/>
+          <w:insideV w:val="single" w:sz="8" w:color="007C83"/>
+        </w:tblBorders>
       </w:tblPr>
       <w:tblGrid>
-        <w:gridCol w:w="4320"/>
-        <w:gridCol w:w="4320"/>
+        <w:gridCol w:w="2340"/>
+        <w:gridCol w:w="2340"/>
+        <w:gridCol w:w="2340"/>
+        <w:gridCol w:w="2340"/>
       </w:tblGrid>
       <w:tr>
         <w:tc>
           <w:tcPr>
-            <w:tcW w:type="dxa" w:w="4320"/>
+            <w:tcW w:type="dxa" w:w="2340"/>
+            <w:tcMar>
+              <w:top w:w="90" w:type="dxa"/>
+              <w:start w:w="120" w:type="dxa"/>
+              <w:bottom w:w="90" w:type="dxa"/>
+              <w:end w:w="120" w:type="dxa"/>
+            </w:tcMar>
+            <w:vAlign w:val="center"/>
+            <w:shd w:fill="DDF3F1"/>
           </w:tcPr>
           <w:p>
+            <w:pPr>
+              <w:spacing w:after="0"/>
+              <w:jc w:val="center"/>
+            </w:pPr>
             <w:r>
               <w:rPr>
-                <w:sz w:val="20"/>
+                <w:rFonts w:ascii="Calibri" w:hAnsi="Calibri"/>
+                <w:b/>
+                <w:i w:val="0"/>
+                <w:color w:val="007C83"/>
+                <w:sz w:val="15"/>
               </w:rPr>
-              <w:t>Unit</w:t>
+              <w:t>YEAR</w:t>
+              <w:br/>
+            </w:r>
+            <w:r>
+              <w:rPr>
+                <w:rFonts w:ascii="Calibri" w:hAnsi="Calibri"/>
+                <w:b/>
+                <w:i w:val="0"/>
+                <w:color w:val="17324D"/>
+                <w:sz w:val="21"/>
+              </w:rPr>
+              <w:t>6</w:t>
             </w:r>
           </w:p>
         </w:tc>
         <w:tc>
           <w:tcPr>
-            <w:tcW w:type="dxa" w:w="4320"/>
+            <w:tcW w:type="dxa" w:w="2340"/>
+            <w:tcMar>
+              <w:top w:w="90" w:type="dxa"/>
+              <w:start w:w="120" w:type="dxa"/>
+              <w:bottom w:w="90" w:type="dxa"/>
+              <w:end w:w="120" w:type="dxa"/>
+            </w:tcMar>
+            <w:vAlign w:val="center"/>
+            <w:shd w:fill="F4F7F8"/>
+          </w:tcPr>
+          <w:p>
+            <w:pPr>
+              <w:spacing w:after="0"/>
+              <w:jc w:val="center"/>
+            </w:pPr>
+            <w:r>
+              <w:rPr>
+                <w:rFonts w:ascii="Calibri" w:hAnsi="Calibri"/>
+                <w:b/>
+                <w:i w:val="0"/>
+                <w:color w:val="007C83"/>
+                <w:sz w:val="15"/>
+              </w:rPr>
+              <w:t>DURATION</w:t>
+              <w:br/>
+            </w:r>
+            <w:r>
+              <w:rPr>
+                <w:rFonts w:ascii="Calibri" w:hAnsi="Calibri"/>
+                <w:b/>
+                <w:i w:val="0"/>
+                <w:color w:val="17324D"/>
+                <w:sz w:val="21"/>
+              </w:rPr>
+              <w:t>60 min</w:t>
+            </w:r>
+          </w:p>
+        </w:tc>
+        <w:tc>
+          <w:tcPr>
+            <w:tcW w:type="dxa" w:w="2340"/>
+            <w:tcMar>
+              <w:top w:w="90" w:type="dxa"/>
+              <w:start w:w="120" w:type="dxa"/>
+              <w:bottom w:w="90" w:type="dxa"/>
+              <w:end w:w="120" w:type="dxa"/>
+            </w:tcMar>
+            <w:vAlign w:val="center"/>
+            <w:shd w:fill="DDF3F1"/>
+          </w:tcPr>
+          <w:p>
+            <w:pPr>
+              <w:spacing w:after="0"/>
+              <w:jc w:val="center"/>
+            </w:pPr>
+            <w:r>
+              <w:rPr>
+                <w:rFonts w:ascii="Calibri" w:hAnsi="Calibri"/>
+                <w:b/>
+                <w:i w:val="0"/>
+                <w:color w:val="007C83"/>
+                <w:sz w:val="15"/>
+              </w:rPr>
+              <w:t>EVIDENCE</w:t>
+              <w:br/>
+            </w:r>
+            <w:r>
+              <w:rPr>
+                <w:rFonts w:ascii="Calibri" w:hAnsi="Calibri"/>
+                <w:b/>
+                <w:i w:val="0"/>
+                <w:color w:val="17324D"/>
+                <w:sz w:val="21"/>
+              </w:rPr>
+              <w:t>Workbook pp. 2-6</w:t>
+            </w:r>
+          </w:p>
+        </w:tc>
+        <w:tc>
+          <w:tcPr>
+            <w:tcW w:type="dxa" w:w="2340"/>
+            <w:tcMar>
+              <w:top w:w="90" w:type="dxa"/>
+              <w:start w:w="120" w:type="dxa"/>
+              <w:bottom w:w="90" w:type="dxa"/>
+              <w:end w:w="120" w:type="dxa"/>
+            </w:tcMar>
+            <w:vAlign w:val="center"/>
+            <w:shd w:fill="F4F7F8"/>
+          </w:tcPr>
+          <w:p>
+            <w:pPr>
+              <w:spacing w:after="0"/>
+              <w:jc w:val="center"/>
+            </w:pPr>
+            <w:r>
+              <w:rPr>
+                <w:rFonts w:ascii="Calibri" w:hAnsi="Calibri"/>
+                <w:b/>
+                <w:i w:val="0"/>
+                <w:color w:val="007C83"/>
+                <w:sz w:val="15"/>
+              </w:rPr>
+              <w:t>CODES</w:t>
+              <w:br/>
+            </w:r>
+            <w:r>
+              <w:rPr>
+                <w:rFonts w:ascii="Calibri" w:hAnsi="Calibri"/>
+                <w:b/>
+                <w:i w:val="0"/>
+                <w:color w:val="17324D"/>
+                <w:sz w:val="21"/>
+              </w:rPr>
+              <w:t>ACPPS060 | ACPMP064</w:t>
+            </w:r>
+          </w:p>
+        </w:tc>
+      </w:tr>
+    </w:tbl>
+    <w:p>
+      <w:pPr>
+        <w:spacing w:after="0"/>
+      </w:pPr>
+    </w:p>
+    <w:tbl>
+      <w:tblPr>
+        <w:tblW w:type="dxa" w:w="9360"/>
+        <w:tblLayout w:type="fixed"/>
+        <w:tblLook w:firstColumn="1" w:firstRow="1" w:lastColumn="0" w:lastRow="0" w:noHBand="0" w:noVBand="1" w:val="04A0"/>
+        <w:tblInd w:w="120" w:type="dxa"/>
+        <w:tblBorders>
+          <w:top w:val="single" w:sz="10" w:color="007C83"/>
+          <w:left w:val="single" w:sz="10" w:color="007C83"/>
+          <w:bottom w:val="single" w:sz="10" w:color="007C83"/>
+          <w:right w:val="single" w:sz="10" w:color="007C83"/>
+        </w:tblBorders>
+      </w:tblPr>
+      <w:tblGrid>
+        <w:gridCol w:w="9360"/>
+      </w:tblGrid>
+      <w:tr>
+        <w:tc>
+          <w:tcPr>
+            <w:tcW w:type="dxa" w:w="9360"/>
+            <w:tcMar>
+              <w:top w:w="90" w:type="dxa"/>
+              <w:start w:w="120" w:type="dxa"/>
+              <w:bottom w:w="90" w:type="dxa"/>
+              <w:end w:w="120" w:type="dxa"/>
+            </w:tcMar>
+            <w:vAlign w:val="center"/>
+            <w:shd w:fill="DDF3F1"/>
+          </w:tcPr>
+          <w:p>
+            <w:pPr>
+              <w:spacing w:after="0"/>
+            </w:pPr>
+            <w:r>
+              <w:rPr>
+                <w:rFonts w:ascii="Calibri" w:hAnsi="Calibri"/>
+                <w:b/>
+                <w:i w:val="0"/>
+                <w:color w:val="007C83"/>
+                <w:sz w:val="18"/>
+              </w:rPr>
+              <w:t xml:space="preserve">LESSON DESTINATION  </w:t>
+            </w:r>
+            <w:r>
+              <w:rPr>
+                <w:rFonts w:ascii="Calibri" w:hAnsi="Calibri"/>
+                <w:b w:val="0"/>
+                <w:i w:val="0"/>
+                <w:color w:val="18242F"/>
+                <w:sz w:val="21"/>
+              </w:rPr>
+              <w:t>Students produce a personal activity profile, compare cultural activities, and revise an inclusive community-activity proposal using peer feedback.</w:t>
+            </w:r>
+          </w:p>
+        </w:tc>
+      </w:tr>
+    </w:tbl>
+    <w:p>
+      <w:pPr>
+        <w:spacing w:after="0"/>
+      </w:pPr>
+    </w:p>
+    <w:p>
+      <w:pPr>
+        <w:pStyle w:val="Heading1"/>
+      </w:pPr>
+      <w:r>
+        <w:t>Learning and evidence</w:t>
+      </w:r>
+    </w:p>
+    <w:tbl>
+      <w:tblPr>
+        <w:tblW w:type="dxa" w:w="9360"/>
+        <w:tblLayout w:type="fixed"/>
+        <w:tblLook w:firstColumn="1" w:firstRow="1" w:lastColumn="0" w:lastRow="0" w:noHBand="0" w:noVBand="1" w:val="04A0"/>
+        <w:tblInd w:w="120" w:type="dxa"/>
+        <w:tblBorders>
+          <w:top w:val="single" w:sz="6" w:color="CBD5DC"/>
+          <w:left w:val="single" w:sz="6" w:color="CBD5DC"/>
+          <w:bottom w:val="single" w:sz="6" w:color="CBD5DC"/>
+          <w:right w:val="single" w:sz="6" w:color="CBD5DC"/>
+          <w:insideH w:val="single" w:sz="6" w:color="CBD5DC"/>
+          <w:insideV w:val="single" w:sz="6" w:color="CBD5DC"/>
+        </w:tblBorders>
+      </w:tblPr>
+      <w:tblGrid>
+        <w:gridCol w:w="4680"/>
+        <w:gridCol w:w="4680"/>
+      </w:tblGrid>
+      <w:tr>
+        <w:trPr>
+          <w:tblHeader w:val="true"/>
+        </w:trPr>
+        <w:tc>
+          <w:tcPr>
+            <w:tcW w:type="dxa" w:w="4680"/>
+            <w:tcMar>
+              <w:top w:w="90" w:type="dxa"/>
+              <w:start w:w="120" w:type="dxa"/>
+              <w:bottom w:w="90" w:type="dxa"/>
+              <w:end w:w="120" w:type="dxa"/>
+            </w:tcMar>
+            <w:vAlign w:val="center"/>
+            <w:shd w:fill="DDF3F1"/>
           </w:tcPr>
           <w:p>
             <w:r>
               <w:rPr>
+                <w:rFonts w:ascii="Calibri" w:hAnsi="Calibri"/>
+                <w:b/>
+                <w:i w:val="0"/>
+                <w:color w:val="17324D"/>
                 <w:sz w:val="20"/>
               </w:rPr>
-              <w:t>Let's All Be Active (Term 3)</w:t>
+              <w:t>Learning intention</w:t>
+            </w:r>
+          </w:p>
+        </w:tc>
+        <w:tc>
+          <w:tcPr>
+            <w:tcW w:type="dxa" w:w="4680"/>
+            <w:tcMar>
+              <w:top w:w="90" w:type="dxa"/>
+              <w:start w:w="120" w:type="dxa"/>
+              <w:bottom w:w="90" w:type="dxa"/>
+              <w:end w:w="120" w:type="dxa"/>
+            </w:tcMar>
+            <w:vAlign w:val="center"/>
+            <w:shd w:fill="FFF1D8"/>
+          </w:tcPr>
+          <w:p>
+            <w:r>
+              <w:rPr>
+                <w:rFonts w:ascii="Calibri" w:hAnsi="Calibri"/>
+                <w:b/>
+                <w:i w:val="0"/>
+                <w:color w:val="17324D"/>
+                <w:sz w:val="20"/>
+              </w:rPr>
+              <w:t>Success evidence</w:t>
             </w:r>
           </w:p>
         </w:tc>
@@ -68,27 +385,324 @@
       <w:tr>
         <w:tc>
           <w:tcPr>
-            <w:tcW w:type="dxa" w:w="4320"/>
+            <w:tcW w:type="dxa" w:w="4680"/>
           </w:tcPr>
           <w:p>
+            <w:pPr>
+              <w:pStyle w:val="ListBullet"/>
+              <w:spacing w:after="60"/>
+            </w:pPr>
             <w:r>
               <w:rPr>
-                <w:sz w:val="20"/>
+                <w:rFonts w:ascii="Calibri" w:hAnsi="Calibri"/>
+                <w:b w:val="0"/>
+                <w:i w:val="0"/>
+                <w:color w:val="18242F"/>
+                <w:sz w:val="19"/>
               </w:rPr>
-              <w:t>Topic</w:t>
+              <w:t>Explain how personal and cultural physical-activity choices show diversity.</w:t>
+            </w:r>
+          </w:p>
+          <w:p>
+            <w:pPr>
+              <w:pStyle w:val="ListBullet"/>
+              <w:spacing w:after="60"/>
+            </w:pPr>
+            <w:r>
+              <w:rPr>
+                <w:rFonts w:ascii="Calibri" w:hAnsi="Calibri"/>
+                <w:b w:val="0"/>
+                <w:i w:val="0"/>
+                <w:color w:val="18242F"/>
+                <w:sz w:val="19"/>
+              </w:rPr>
+              <w:t>Explain how valuing that diversity can improve belonging, participation and community wellbeing.</w:t>
             </w:r>
           </w:p>
         </w:tc>
         <w:tc>
           <w:tcPr>
-            <w:tcW w:type="dxa" w:w="4320"/>
+            <w:tcW w:type="dxa" w:w="4680"/>
+          </w:tcPr>
+          <w:p>
+            <w:pPr>
+              <w:pStyle w:val="ListBullet"/>
+              <w:spacing w:after="60"/>
+            </w:pPr>
+            <w:r>
+              <w:rPr>
+                <w:rFonts w:ascii="Calibri" w:hAnsi="Calibri"/>
+                <w:b w:val="0"/>
+                <w:i w:val="0"/>
+                <w:color w:val="18242F"/>
+                <w:sz w:val="19"/>
+              </w:rPr>
+              <w:t>I define physical activity and show what, where and why in my own profile.</w:t>
+            </w:r>
+          </w:p>
+          <w:p>
+            <w:pPr>
+              <w:pStyle w:val="ListBullet"/>
+              <w:spacing w:after="60"/>
+            </w:pPr>
+            <w:r>
+              <w:rPr>
+                <w:rFonts w:ascii="Calibri" w:hAnsi="Calibri"/>
+                <w:b w:val="0"/>
+                <w:i w:val="0"/>
+                <w:color w:val="18242F"/>
+                <w:sz w:val="19"/>
+              </w:rPr>
+              <w:t>I compare two cultural activities using accurate evidence.</w:t>
+            </w:r>
+          </w:p>
+          <w:p>
+            <w:pPr>
+              <w:pStyle w:val="ListBullet"/>
+              <w:spacing w:after="60"/>
+            </w:pPr>
+            <w:r>
+              <w:rPr>
+                <w:rFonts w:ascii="Calibri" w:hAnsi="Calibri"/>
+                <w:b w:val="0"/>
+                <w:i w:val="0"/>
+                <w:color w:val="18242F"/>
+                <w:sz w:val="19"/>
+              </w:rPr>
+              <w:t>I propose an inclusive activity and justify one revision with because.</w:t>
+            </w:r>
+          </w:p>
+        </w:tc>
+      </w:tr>
+    </w:tbl>
+    <w:p>
+      <w:pPr>
+        <w:pStyle w:val="Heading2"/>
+      </w:pPr>
+      <w:r>
+        <w:t>Before the lesson</w:t>
+      </w:r>
+    </w:p>
+    <w:p>
+      <w:pPr>
+        <w:pStyle w:val="ListBullet"/>
+        <w:spacing w:after="80" w:line="276" w:lineRule="auto"/>
+        <w:ind w:left="720" w:hanging="360"/>
+      </w:pPr>
+      <w:r>
+        <w:rPr>
+          <w:rFonts w:ascii="Calibri" w:hAnsi="Calibri"/>
+          <w:b w:val="0"/>
+          <w:i w:val="0"/>
+          <w:color w:val="18242F"/>
+          <w:sz w:val="21"/>
+        </w:rPr>
+        <w:t>Print the Student Workbook double-sided (one per student). Keep completed workbooks as Week 1 evidence.</w:t>
+      </w:r>
+    </w:p>
+    <w:p>
+      <w:pPr>
+        <w:pStyle w:val="ListBullet"/>
+        <w:spacing w:after="80" w:line="276" w:lineRule="auto"/>
+        <w:ind w:left="720" w:hanging="360"/>
+      </w:pPr>
+      <w:r>
+        <w:rPr>
+          <w:rFonts w:ascii="Calibri" w:hAnsi="Calibri"/>
+          <w:b w:val="0"/>
+          <w:i w:val="0"/>
+          <w:color w:val="18242F"/>
+          <w:sz w:val="21"/>
+        </w:rPr>
+        <w:t>Print and cut one set of Cultural Activity Evidence Cards per five groups. Assign one card to each group.</w:t>
+      </w:r>
+    </w:p>
+    <w:p>
+      <w:pPr>
+        <w:pStyle w:val="ListBullet"/>
+        <w:spacing w:after="80" w:line="276" w:lineRule="auto"/>
+        <w:ind w:left="720" w:hanging="360"/>
+      </w:pPr>
+      <w:r>
+        <w:rPr>
+          <w:rFonts w:ascii="Calibri" w:hAnsi="Calibri"/>
+          <w:b w:val="0"/>
+          <w:i w:val="0"/>
+          <w:color w:val="18242F"/>
+          <w:sz w:val="21"/>
+        </w:rPr>
+        <w:t>Open Lesson 1_Presentation.html. It works offline; use N for teacher notes, F for fullscreen and R to reset the current slide.</w:t>
+      </w:r>
+    </w:p>
+    <w:p>
+      <w:pPr>
+        <w:pStyle w:val="ListBullet"/>
+        <w:spacing w:after="80" w:line="276" w:lineRule="auto"/>
+        <w:ind w:left="720" w:hanging="360"/>
+      </w:pPr>
+      <w:r>
+        <w:rPr>
+          <w:rFonts w:ascii="Calibri" w:hAnsi="Calibri"/>
+          <w:b w:val="0"/>
+          <w:i w:val="0"/>
+          <w:color w:val="18242F"/>
+          <w:sz w:val="21"/>
+        </w:rPr>
+        <w:t>If running a movement demonstration, prepare a soft ball and four markers, complete school risk-management requirements, and check space, footwear, sun safety and equipment.</w:t>
+      </w:r>
+    </w:p>
+    <w:p>
+      <w:pPr>
+        <w:pStyle w:val="ListBullet"/>
+        <w:spacing w:after="80" w:line="276" w:lineRule="auto"/>
+        <w:ind w:left="720" w:hanging="360"/>
+      </w:pPr>
+      <w:r>
+        <w:rPr>
+          <w:rFonts w:ascii="Calibri" w:hAnsi="Calibri"/>
+          <w:b w:val="0"/>
+          <w:i w:val="0"/>
+          <w:color w:val="18242F"/>
+          <w:sz w:val="21"/>
+        </w:rPr>
+        <w:t>For First Nations games, follow local school protocols. Where practical, inform or invite local Elders or First Nations groups rather than presenting one activity as representative of all cultures.</w:t>
+      </w:r>
+    </w:p>
+    <w:p>
+      <w:r>
+        <w:br w:type="page"/>
+      </w:r>
+    </w:p>
+    <w:p>
+      <w:pPr>
+        <w:pStyle w:val="Heading1"/>
+      </w:pPr>
+      <w:r>
+        <w:t>Teaching sequence</w:t>
+      </w:r>
+    </w:p>
+    <w:tbl>
+      <w:tblPr>
+        <w:tblW w:type="dxa" w:w="9360"/>
+        <w:tblLayout w:type="fixed"/>
+        <w:tblLook w:firstColumn="1" w:firstRow="1" w:lastColumn="0" w:lastRow="0" w:noHBand="0" w:noVBand="1" w:val="04A0"/>
+        <w:tblInd w:w="120" w:type="dxa"/>
+        <w:tblBorders>
+          <w:top w:val="single" w:sz="6" w:color="CBD5DC"/>
+          <w:left w:val="single" w:sz="6" w:color="CBD5DC"/>
+          <w:bottom w:val="single" w:sz="6" w:color="CBD5DC"/>
+          <w:right w:val="single" w:sz="6" w:color="CBD5DC"/>
+          <w:insideH w:val="single" w:sz="6" w:color="CBD5DC"/>
+          <w:insideV w:val="single" w:sz="6" w:color="CBD5DC"/>
+        </w:tblBorders>
+      </w:tblPr>
+      <w:tblGrid>
+        <w:gridCol w:w="720"/>
+        <w:gridCol w:w="1800"/>
+        <w:gridCol w:w="4680"/>
+        <w:gridCol w:w="2160"/>
+      </w:tblGrid>
+      <w:tr>
+        <w:trPr>
+          <w:tblHeader w:val="true"/>
+        </w:trPr>
+        <w:tc>
+          <w:tcPr>
+            <w:tcW w:type="dxa" w:w="720"/>
+            <w:tcMar>
+              <w:top w:w="90" w:type="dxa"/>
+              <w:start w:w="120" w:type="dxa"/>
+              <w:bottom w:w="90" w:type="dxa"/>
+              <w:end w:w="120" w:type="dxa"/>
+            </w:tcMar>
+            <w:vAlign w:val="center"/>
+            <w:shd w:fill="17324D"/>
           </w:tcPr>
           <w:p>
             <w:r>
               <w:rPr>
-                <w:sz w:val="20"/>
+                <w:rFonts w:ascii="Calibri" w:hAnsi="Calibri"/>
+                <w:b/>
+                <w:i w:val="0"/>
+                <w:color w:val="FFFFFF"/>
+                <w:sz w:val="18"/>
               </w:rPr>
-              <w:t>Topic 1 — Valuing diversity influences community wellbeing</w:t>
+              <w:t>Min</w:t>
+            </w:r>
+          </w:p>
+        </w:tc>
+        <w:tc>
+          <w:tcPr>
+            <w:tcW w:type="dxa" w:w="1800"/>
+            <w:tcMar>
+              <w:top w:w="90" w:type="dxa"/>
+              <w:start w:w="120" w:type="dxa"/>
+              <w:bottom w:w="90" w:type="dxa"/>
+              <w:end w:w="120" w:type="dxa"/>
+            </w:tcMar>
+            <w:vAlign w:val="center"/>
+            <w:shd w:fill="17324D"/>
+          </w:tcPr>
+          <w:p>
+            <w:r>
+              <w:rPr>
+                <w:rFonts w:ascii="Calibri" w:hAnsi="Calibri"/>
+                <w:b/>
+                <w:i w:val="0"/>
+                <w:color w:val="FFFFFF"/>
+                <w:sz w:val="18"/>
+              </w:rPr>
+              <w:t>Phase</w:t>
+            </w:r>
+          </w:p>
+        </w:tc>
+        <w:tc>
+          <w:tcPr>
+            <w:tcW w:type="dxa" w:w="4680"/>
+            <w:tcMar>
+              <w:top w:w="90" w:type="dxa"/>
+              <w:start w:w="120" w:type="dxa"/>
+              <w:bottom w:w="90" w:type="dxa"/>
+              <w:end w:w="120" w:type="dxa"/>
+            </w:tcMar>
+            <w:vAlign w:val="center"/>
+            <w:shd w:fill="17324D"/>
+          </w:tcPr>
+          <w:p>
+            <w:r>
+              <w:rPr>
+                <w:rFonts w:ascii="Calibri" w:hAnsi="Calibri"/>
+                <w:b/>
+                <w:i w:val="0"/>
+                <w:color w:val="FFFFFF"/>
+                <w:sz w:val="18"/>
+              </w:rPr>
+              <w:t>Teacher moves</w:t>
+            </w:r>
+          </w:p>
+        </w:tc>
+        <w:tc>
+          <w:tcPr>
+            <w:tcW w:type="dxa" w:w="2160"/>
+            <w:tcMar>
+              <w:top w:w="90" w:type="dxa"/>
+              <w:start w:w="120" w:type="dxa"/>
+              <w:bottom w:w="90" w:type="dxa"/>
+              <w:end w:w="120" w:type="dxa"/>
+            </w:tcMar>
+            <w:vAlign w:val="center"/>
+            <w:shd w:fill="17324D"/>
+          </w:tcPr>
+          <w:p>
+            <w:r>
+              <w:rPr>
+                <w:rFonts w:ascii="Calibri" w:hAnsi="Calibri"/>
+                <w:b/>
+                <w:i w:val="0"/>
+                <w:color w:val="FFFFFF"/>
+                <w:sz w:val="18"/>
+              </w:rPr>
+              <w:t>Evidence to notice</w:t>
             </w:r>
           </w:p>
         </w:tc>
@@ -96,27 +710,85 @@
       <w:tr>
         <w:tc>
           <w:tcPr>
-            <w:tcW w:type="dxa" w:w="4320"/>
+            <w:tcW w:type="dxa" w:w="720"/>
+            <w:shd w:fill="F4F7F8"/>
           </w:tcPr>
           <w:p>
+            <w:pPr>
+              <w:spacing w:after="0"/>
+            </w:pPr>
             <w:r>
               <w:rPr>
-                <w:sz w:val="20"/>
+                <w:rFonts w:ascii="Calibri" w:hAnsi="Calibri"/>
+                <w:b w:val="0"/>
+                <w:i w:val="0"/>
+                <w:color w:val="18242F"/>
+                <w:sz w:val="17"/>
               </w:rPr>
-              <w:t>Year Level</w:t>
+              <w:t>0-5</w:t>
             </w:r>
           </w:p>
         </w:tc>
         <w:tc>
           <w:tcPr>
-            <w:tcW w:type="dxa" w:w="4320"/>
+            <w:tcW w:type="dxa" w:w="1800"/>
+            <w:shd w:fill="F4F7F8"/>
           </w:tcPr>
           <w:p>
+            <w:pPr>
+              <w:spacing w:after="0"/>
+            </w:pPr>
             <w:r>
               <w:rPr>
-                <w:sz w:val="20"/>
+                <w:rFonts w:ascii="Calibri" w:hAnsi="Calibri"/>
+                <w:b/>
+                <w:i w:val="0"/>
+                <w:color w:val="17324D"/>
+                <w:sz w:val="17"/>
               </w:rPr>
-              <w:t>Year 6</w:t>
+              <w:t>Enter: What counts?</w:t>
+            </w:r>
+          </w:p>
+        </w:tc>
+        <w:tc>
+          <w:tcPr>
+            <w:tcW w:type="dxa" w:w="4680"/>
+            <w:shd w:fill="F4F7F8"/>
+          </w:tcPr>
+          <w:p>
+            <w:pPr>
+              <w:spacing w:after="0"/>
+            </w:pPr>
+            <w:r>
+              <w:rPr>
+                <w:rFonts w:ascii="Calibri" w:hAnsi="Calibri"/>
+                <w:b w:val="0"/>
+                <w:i w:val="0"/>
+                <w:color w:val="18242F"/>
+                <w:sz w:val="17"/>
+              </w:rPr>
+              <w:t>Project six examples. Students silently choose: definitely physical activity, depends, or not physical activity. Take two contrasting justifications before revealing.</w:t>
+            </w:r>
+          </w:p>
+        </w:tc>
+        <w:tc>
+          <w:tcPr>
+            <w:tcW w:type="dxa" w:w="2160"/>
+            <w:shd w:fill="F4F7F8"/>
+          </w:tcPr>
+          <w:p>
+            <w:pPr>
+              <w:spacing w:after="0"/>
+            </w:pPr>
+            <w:r>
+              <w:rPr>
+                <w:rFonts w:ascii="Calibri" w:hAnsi="Calibri"/>
+                <w:b w:val="0"/>
+                <w:i w:val="0"/>
+                <w:color w:val="18242F"/>
+                <w:sz w:val="17"/>
+              </w:rPr>
+              <w:t>Listen for the misconception that only organised sport or hard exercise counts.</w:t>
             </w:r>
           </w:p>
         </w:tc>
@@ -124,329 +796,61 @@
       <w:tr>
         <w:tc>
           <w:tcPr>
-            <w:tcW w:type="dxa" w:w="4320"/>
+            <w:tcW w:type="dxa" w:w="720"/>
           </w:tcPr>
           <w:p>
+            <w:pPr>
+              <w:spacing w:after="0"/>
+            </w:pPr>
             <w:r>
               <w:rPr>
-                <w:sz w:val="20"/>
+                <w:rFonts w:ascii="Calibri" w:hAnsi="Calibri"/>
+                <w:b w:val="0"/>
+                <w:i w:val="0"/>
+                <w:color w:val="18242F"/>
+                <w:sz w:val="17"/>
               </w:rPr>
-              <w:t>Duration</w:t>
+              <w:t>5-11</w:t>
             </w:r>
           </w:p>
         </w:tc>
         <w:tc>
           <w:tcPr>
-            <w:tcW w:type="dxa" w:w="4320"/>
+            <w:tcW w:type="dxa" w:w="1800"/>
           </w:tcPr>
           <w:p>
+            <w:pPr>
+              <w:spacing w:after="0"/>
+            </w:pPr>
             <w:r>
               <w:rPr>
-                <w:sz w:val="20"/>
+                <w:rFonts w:ascii="Calibri" w:hAnsi="Calibri"/>
+                <w:b/>
+                <w:i w:val="0"/>
+                <w:color w:val="17324D"/>
+                <w:sz w:val="17"/>
               </w:rPr>
-              <w:t>60 minutes</w:t>
-            </w:r>
-          </w:p>
-        </w:tc>
-      </w:tr>
-      <w:tr>
-        <w:tc>
-          <w:tcPr>
-            <w:tcW w:type="dxa" w:w="4320"/>
-          </w:tcPr>
-          <w:p>
-            <w:r>
-              <w:rPr>
-                <w:sz w:val="20"/>
-              </w:rPr>
-              <w:t>Curriculum</w:t>
+              <w:t>Define and refine</w:t>
             </w:r>
           </w:p>
         </w:tc>
         <w:tc>
           <w:tcPr>
-            <w:tcW w:type="dxa" w:w="4320"/>
+            <w:tcW w:type="dxa" w:w="4680"/>
           </w:tcPr>
           <w:p>
+            <w:pPr>
+              <w:spacing w:after="0"/>
+            </w:pPr>
             <w:r>
               <w:rPr>
-                <w:sz w:val="20"/>
+                <w:rFonts w:ascii="Calibri" w:hAnsi="Calibri"/>
+                <w:b w:val="0"/>
+                <w:i w:val="0"/>
+                <w:color w:val="18242F"/>
+                <w:sz w:val="17"/>
               </w:rPr>
-              <w:t>ACPPS060 — Identify how valuing diversity positively influences the wellbeing of the community; ACPMP064 — Participate in physical activities designed to enhance fitness, and discuss the impact regular participation can have on health and wellbeing</w:t>
-            </w:r>
-          </w:p>
-        </w:tc>
-      </w:tr>
-      <w:tr>
-        <w:tc>
-          <w:tcPr>
-            <w:tcW w:type="dxa" w:w="4320"/>
-          </w:tcPr>
-          <w:p>
-            <w:r>
-              <w:rPr>
-                <w:sz w:val="20"/>
-              </w:rPr>
-              <w:t>General Capabilities</w:t>
-            </w:r>
-          </w:p>
-        </w:tc>
-        <w:tc>
-          <w:tcPr>
-            <w:tcW w:type="dxa" w:w="4320"/>
-          </w:tcPr>
-          <w:p>
-            <w:r>
-              <w:rPr>
-                <w:sz w:val="20"/>
-              </w:rPr>
-              <w:t>Literacy (Comprehending texts, Composing texts, Visual knowledge); Intercultural understanding (Recognising culture and developing respect)</w:t>
-            </w:r>
-          </w:p>
-        </w:tc>
-      </w:tr>
-    </w:tbl>
-    <w:p/>
-    <w:p>
-      <w:r>
-        <w:rPr>
-          <w:b/>
-          <w:sz w:val="24"/>
-        </w:rPr>
-        <w:t>Learning Intentions</w:t>
-      </w:r>
-    </w:p>
-    <w:p>
-      <w:r>
-        <w:t>We are learning to:</w:t>
-      </w:r>
-    </w:p>
-    <w:p>
-      <w:pPr>
-        <w:pStyle w:val="ListBullet"/>
-      </w:pPr>
-      <w:r>
-        <w:t>Define physical activity and reflect on our own activity choices</w:t>
-      </w:r>
-    </w:p>
-    <w:p>
-      <w:pPr>
-        <w:pStyle w:val="ListBullet"/>
-      </w:pPr>
-      <w:r>
-        <w:t>Explain reasons why people choose to participate in different physical activities</w:t>
-      </w:r>
-    </w:p>
-    <w:p>
-      <w:pPr>
-        <w:pStyle w:val="ListBullet"/>
-      </w:pPr>
-      <w:r>
-        <w:t>Recognise that diverse groups participate in physical activity, including activities from Aboriginal peoples', Torres Strait Islander peoples' and Asian cultures</w:t>
-      </w:r>
-    </w:p>
-    <w:p>
-      <w:r>
-        <w:rPr>
-          <w:b/>
-          <w:sz w:val="24"/>
-        </w:rPr>
-        <w:t>Success Criteria</w:t>
-      </w:r>
-    </w:p>
-    <w:p>
-      <w:r>
-        <w:t>I can:</w:t>
-      </w:r>
-    </w:p>
-    <w:p>
-      <w:pPr>
-        <w:pStyle w:val="ListBullet"/>
-      </w:pPr>
-      <w:r>
-        <w:t>Define physical activity in my own words</w:t>
-      </w:r>
-    </w:p>
-    <w:p>
-      <w:pPr>
-        <w:pStyle w:val="ListBullet"/>
-      </w:pPr>
-      <w:r>
-        <w:t>Describe my own physical activity choices, where I am active, and why I participate</w:t>
-      </w:r>
-    </w:p>
-    <w:p>
-      <w:pPr>
-        <w:pStyle w:val="ListBullet"/>
-      </w:pPr>
-      <w:r>
-        <w:t>Name at least three different types of physical activity found in the community</w:t>
-      </w:r>
-    </w:p>
-    <w:p>
-      <w:pPr>
-        <w:pStyle w:val="ListBullet"/>
-      </w:pPr>
-      <w:r>
-        <w:t>Give an example of a cultural physical activity and explain where it comes from</w:t>
-      </w:r>
-    </w:p>
-    <w:p>
-      <w:pPr>
-        <w:pStyle w:val="ListBullet"/>
-      </w:pPr>
-      <w:r>
-        <w:t>Explain one way different groups can work together through physical activity</w:t>
-      </w:r>
-    </w:p>
-    <w:p>
-      <w:r>
-        <w:rPr>
-          <w:b/>
-          <w:sz w:val="24"/>
-        </w:rPr>
-        <w:t>Resources Required</w:t>
-      </w:r>
-    </w:p>
-    <w:p>
-      <w:pPr>
-        <w:pStyle w:val="ListBullet"/>
-      </w:pPr>
-      <w:r>
-        <w:t>Lesson 1 — Presentation (HTML)</w:t>
-      </w:r>
-    </w:p>
-    <w:p>
-      <w:pPr>
-        <w:pStyle w:val="ListBullet"/>
-      </w:pPr>
-      <w:r>
-        <w:t>Lesson 1 — Student Worksheet (one per student)</w:t>
-      </w:r>
-    </w:p>
-    <w:p>
-      <w:pPr>
-        <w:pStyle w:val="ListBullet"/>
-      </w:pPr>
-      <w:r>
-        <w:t>C2C Sheet — My physical activity (PPS_Y06_U2_SH_MyPhysicalActivity)</w:t>
-      </w:r>
-    </w:p>
-    <w:p>
-      <w:pPr>
-        <w:pStyle w:val="ListBullet"/>
-      </w:pPr>
-      <w:r>
-        <w:t>C2C Sheet — Physical activity alphabet (PPS_Y06_U2_SH_PAAlphabet)</w:t>
-      </w:r>
-    </w:p>
-    <w:p>
-      <w:pPr>
-        <w:pStyle w:val="ListBullet"/>
-      </w:pPr>
-      <w:r>
-        <w:t>C2C SLR — Physical activity alphabet, Information on physical activity</w:t>
-      </w:r>
-    </w:p>
-    <w:p>
-      <w:pPr>
-        <w:pStyle w:val="ListBullet"/>
-      </w:pPr>
-      <w:r>
-        <w:t>C2C SLR — Dabi, Edor, Keentan, Wana Wana, Tai chi background</w:t>
-      </w:r>
-    </w:p>
-    <w:p>
-      <w:pPr>
-        <w:pStyle w:val="ListBullet"/>
-      </w:pPr>
-      <w:r>
-        <w:t>Open space for short cultural game demonstrations (optional)</w:t>
-      </w:r>
-    </w:p>
-    <w:p>
-      <w:pPr>
-        <w:pStyle w:val="ListBullet"/>
-      </w:pPr>
-      <w:r>
-        <w:t>Whiteboard / interactive board</w:t>
-      </w:r>
-    </w:p>
-    <w:p>
-      <w:r>
-        <w:rPr>
-          <w:b/>
-          <w:sz w:val="26"/>
-        </w:rPr>
-        <w:t>Lesson Sequence</w:t>
-      </w:r>
-    </w:p>
-    <w:tbl>
-      <w:tblPr>
-        <w:tblStyle w:val="TableGrid"/>
-        <w:tblW w:type="auto" w:w="0"/>
-        <w:tblLook w:firstColumn="1" w:firstRow="1" w:lastColumn="0" w:lastRow="0" w:noHBand="0" w:noVBand="1" w:val="04A0"/>
-      </w:tblPr>
-      <w:tblGrid>
-        <w:gridCol w:w="2160"/>
-        <w:gridCol w:w="2160"/>
-        <w:gridCol w:w="2160"/>
-        <w:gridCol w:w="2160"/>
-      </w:tblGrid>
-      <w:tr>
-        <w:tc>
-          <w:tcPr>
-            <w:tcW w:type="dxa" w:w="2160"/>
-            <w:shd w:fill="D9E2F3" w:val="clear"/>
-          </w:tcPr>
-          <w:p>
-            <w:r>
-              <w:t>Time</w:t>
-            </w:r>
-          </w:p>
-        </w:tc>
-        <w:tc>
-          <w:tcPr>
-            <w:tcW w:type="dxa" w:w="2160"/>
-            <w:shd w:fill="D9E2F3" w:val="clear"/>
-          </w:tcPr>
-          <w:p>
-            <w:r>
-              <w:t>Phase</w:t>
-            </w:r>
-          </w:p>
-        </w:tc>
-        <w:tc>
-          <w:tcPr>
-            <w:tcW w:type="dxa" w:w="2160"/>
-            <w:shd w:fill="D9E2F3" w:val="clear"/>
-          </w:tcPr>
-          <w:p>
-            <w:r>
-              <w:t>Teacher Actions</w:t>
-            </w:r>
-          </w:p>
-        </w:tc>
-        <w:tc>
-          <w:tcPr>
-            <w:tcW w:type="dxa" w:w="2160"/>
-            <w:shd w:fill="D9E2F3" w:val="clear"/>
-          </w:tcPr>
-          <w:p>
-            <w:r>
-              <w:t>Student Actions</w:t>
-            </w:r>
-          </w:p>
-        </w:tc>
-      </w:tr>
-      <w:tr>
-        <w:tc>
-          <w:tcPr>
-            <w:tcW w:type="dxa" w:w="2160"/>
-          </w:tcPr>
-          <w:p>
-            <w:r>
-              <w:t>5 min</w:t>
+              <w:t>Co-construct a class definition, then show the Australian Government wording. Clarify that activity can be incidental, exercise, sport or strengthening, and can occur at light, moderate or vigorous intensity.</w:t>
             </w:r>
           </w:p>
         </w:tc>
@@ -455,8 +859,166 @@
             <w:tcW w:type="dxa" w:w="2160"/>
           </w:tcPr>
           <w:p>
+            <w:pPr>
+              <w:spacing w:after="0"/>
+            </w:pPr>
             <w:r>
-              <w:t>Hook</w:t>
+              <w:rPr>
+                <w:rFonts w:ascii="Calibri" w:hAnsi="Calibri"/>
+                <w:b w:val="0"/>
+                <w:i w:val="0"/>
+                <w:color w:val="18242F"/>
+                <w:sz w:val="17"/>
+              </w:rPr>
+              <w:t>Students complete Workbook p.1 and revise one first response.</w:t>
+            </w:r>
+          </w:p>
+        </w:tc>
+      </w:tr>
+      <w:tr>
+        <w:tc>
+          <w:tcPr>
+            <w:tcW w:type="dxa" w:w="720"/>
+            <w:shd w:fill="F4F7F8"/>
+          </w:tcPr>
+          <w:p>
+            <w:pPr>
+              <w:spacing w:after="0"/>
+            </w:pPr>
+            <w:r>
+              <w:rPr>
+                <w:rFonts w:ascii="Calibri" w:hAnsi="Calibri"/>
+                <w:b w:val="0"/>
+                <w:i w:val="0"/>
+                <w:color w:val="18242F"/>
+                <w:sz w:val="17"/>
+              </w:rPr>
+              <w:t>11-23</w:t>
+            </w:r>
+          </w:p>
+        </w:tc>
+        <w:tc>
+          <w:tcPr>
+            <w:tcW w:type="dxa" w:w="1800"/>
+            <w:shd w:fill="F4F7F8"/>
+          </w:tcPr>
+          <w:p>
+            <w:pPr>
+              <w:spacing w:after="0"/>
+            </w:pPr>
+            <w:r>
+              <w:rPr>
+                <w:rFonts w:ascii="Calibri" w:hAnsi="Calibri"/>
+                <w:b/>
+                <w:i w:val="0"/>
+                <w:color w:val="17324D"/>
+                <w:sz w:val="17"/>
+              </w:rPr>
+              <w:t>My movement profile</w:t>
+            </w:r>
+          </w:p>
+        </w:tc>
+        <w:tc>
+          <w:tcPr>
+            <w:tcW w:type="dxa" w:w="4680"/>
+            <w:shd w:fill="F4F7F8"/>
+          </w:tcPr>
+          <w:p>
+            <w:pPr>
+              <w:spacing w:after="0"/>
+            </w:pPr>
+            <w:r>
+              <w:rPr>
+                <w:rFonts w:ascii="Calibri" w:hAnsi="Calibri"/>
+                <w:b w:val="0"/>
+                <w:i w:val="0"/>
+                <w:color w:val="18242F"/>
+                <w:sz w:val="17"/>
+              </w:rPr>
+              <w:t>Model one honest entry: activity, place, frequency, reasons and influence. Students complete Workbook p.2. Offer oral rehearsal before writing.</w:t>
+            </w:r>
+          </w:p>
+        </w:tc>
+        <w:tc>
+          <w:tcPr>
+            <w:tcW w:type="dxa" w:w="2160"/>
+            <w:shd w:fill="F4F7F8"/>
+          </w:tcPr>
+          <w:p>
+            <w:pPr>
+              <w:spacing w:after="0"/>
+            </w:pPr>
+            <w:r>
+              <w:rPr>
+                <w:rFonts w:ascii="Calibri" w:hAnsi="Calibri"/>
+                <w:b w:val="0"/>
+                <w:i w:val="0"/>
+                <w:color w:val="18242F"/>
+                <w:sz w:val="17"/>
+              </w:rPr>
+              <w:t>Conference: ask 'What makes this choice yours?' and 'What might help or limit it?'</w:t>
+            </w:r>
+          </w:p>
+        </w:tc>
+      </w:tr>
+      <w:tr>
+        <w:tc>
+          <w:tcPr>
+            <w:tcW w:type="dxa" w:w="720"/>
+          </w:tcPr>
+          <w:p>
+            <w:pPr>
+              <w:spacing w:after="0"/>
+            </w:pPr>
+            <w:r>
+              <w:rPr>
+                <w:rFonts w:ascii="Calibri" w:hAnsi="Calibri"/>
+                <w:b w:val="0"/>
+                <w:i w:val="0"/>
+                <w:color w:val="18242F"/>
+                <w:sz w:val="17"/>
+              </w:rPr>
+              <w:t>23-29</w:t>
+            </w:r>
+          </w:p>
+        </w:tc>
+        <w:tc>
+          <w:tcPr>
+            <w:tcW w:type="dxa" w:w="1800"/>
+          </w:tcPr>
+          <w:p>
+            <w:pPr>
+              <w:spacing w:after="0"/>
+            </w:pPr>
+            <w:r>
+              <w:rPr>
+                <w:rFonts w:ascii="Calibri" w:hAnsi="Calibri"/>
+                <w:b/>
+                <w:i w:val="0"/>
+                <w:color w:val="17324D"/>
+                <w:sz w:val="17"/>
+              </w:rPr>
+              <w:t>Community alphabet scan</w:t>
+            </w:r>
+          </w:p>
+        </w:tc>
+        <w:tc>
+          <w:tcPr>
+            <w:tcW w:type="dxa" w:w="4680"/>
+          </w:tcPr>
+          <w:p>
+            <w:pPr>
+              <w:spacing w:after="0"/>
+            </w:pPr>
+            <w:r>
+              <w:rPr>
+                <w:rFonts w:ascii="Calibri" w:hAnsi="Calibri"/>
+                <w:b w:val="0"/>
+                <w:i w:val="0"/>
+                <w:color w:val="18242F"/>
+                <w:sz w:val="17"/>
+              </w:rPr>
+              <w:t>Pairs add activities to the A-Z grid, then star three that could welcome people with different interests, abilities or cultural experiences.</w:t>
             </w:r>
           </w:p>
         </w:tc>
@@ -465,8 +1027,166 @@
             <w:tcW w:type="dxa" w:w="2160"/>
           </w:tcPr>
           <w:p>
+            <w:pPr>
+              <w:spacing w:after="0"/>
+            </w:pPr>
             <w:r>
-              <w:t>Display opening slide: images of diverse physical activities (team sport, dance, swimming, cultural games). Ask: 'What counts as physical activity?' Facilitate brief think-pair-share.</w:t>
+              <w:rPr>
+                <w:rFonts w:ascii="Calibri" w:hAnsi="Calibri"/>
+                <w:b w:val="0"/>
+                <w:i w:val="0"/>
+                <w:color w:val="18242F"/>
+                <w:sz w:val="17"/>
+              </w:rPr>
+              <w:t>Do not reward volume alone; ask students to justify one starred choice.</w:t>
+            </w:r>
+          </w:p>
+        </w:tc>
+      </w:tr>
+      <w:tr>
+        <w:tc>
+          <w:tcPr>
+            <w:tcW w:type="dxa" w:w="720"/>
+            <w:shd w:fill="F4F7F8"/>
+          </w:tcPr>
+          <w:p>
+            <w:pPr>
+              <w:spacing w:after="0"/>
+            </w:pPr>
+            <w:r>
+              <w:rPr>
+                <w:rFonts w:ascii="Calibri" w:hAnsi="Calibri"/>
+                <w:b w:val="0"/>
+                <w:i w:val="0"/>
+                <w:color w:val="18242F"/>
+                <w:sz w:val="17"/>
+              </w:rPr>
+              <w:t>29-43</w:t>
+            </w:r>
+          </w:p>
+        </w:tc>
+        <w:tc>
+          <w:tcPr>
+            <w:tcW w:type="dxa" w:w="1800"/>
+            <w:shd w:fill="F4F7F8"/>
+          </w:tcPr>
+          <w:p>
+            <w:pPr>
+              <w:spacing w:after="0"/>
+            </w:pPr>
+            <w:r>
+              <w:rPr>
+                <w:rFonts w:ascii="Calibri" w:hAnsi="Calibri"/>
+                <w:b/>
+                <w:i w:val="0"/>
+                <w:color w:val="17324D"/>
+                <w:sz w:val="17"/>
+              </w:rPr>
+              <w:t>Cultural evidence jigsaw</w:t>
+            </w:r>
+          </w:p>
+        </w:tc>
+        <w:tc>
+          <w:tcPr>
+            <w:tcW w:type="dxa" w:w="4680"/>
+            <w:shd w:fill="F4F7F8"/>
+          </w:tcPr>
+          <w:p>
+            <w:pPr>
+              <w:spacing w:after="0"/>
+            </w:pPr>
+            <w:r>
+              <w:rPr>
+                <w:rFonts w:ascii="Calibri" w:hAnsi="Calibri"/>
+                <w:b w:val="0"/>
+                <w:i w:val="0"/>
+                <w:color w:val="18242F"/>
+                <w:sz w:val="17"/>
+              </w:rPr>
+              <w:t>Teach the respect protocol. Groups read one evidence card and prepare a 30-second briefing: origin, movement, one community value, one accurate caution. Students then collect evidence from a second group.</w:t>
+            </w:r>
+          </w:p>
+        </w:tc>
+        <w:tc>
+          <w:tcPr>
+            <w:tcW w:type="dxa" w:w="2160"/>
+            <w:shd w:fill="F4F7F8"/>
+          </w:tcPr>
+          <w:p>
+            <w:pPr>
+              <w:spacing w:after="0"/>
+            </w:pPr>
+            <w:r>
+              <w:rPr>
+                <w:rFonts w:ascii="Calibri" w:hAnsi="Calibri"/>
+                <w:b w:val="0"/>
+                <w:i w:val="0"/>
+                <w:color w:val="18242F"/>
+                <w:sz w:val="17"/>
+              </w:rPr>
+              <w:t>Check that Edor is linked to Aurukun and that cultures are named specifically where the source permits.</w:t>
+            </w:r>
+          </w:p>
+        </w:tc>
+      </w:tr>
+      <w:tr>
+        <w:tc>
+          <w:tcPr>
+            <w:tcW w:type="dxa" w:w="720"/>
+          </w:tcPr>
+          <w:p>
+            <w:pPr>
+              <w:spacing w:after="0"/>
+            </w:pPr>
+            <w:r>
+              <w:rPr>
+                <w:rFonts w:ascii="Calibri" w:hAnsi="Calibri"/>
+                <w:b w:val="0"/>
+                <w:i w:val="0"/>
+                <w:color w:val="18242F"/>
+                <w:sz w:val="17"/>
+              </w:rPr>
+              <w:t>43-54</w:t>
+            </w:r>
+          </w:p>
+        </w:tc>
+        <w:tc>
+          <w:tcPr>
+            <w:tcW w:type="dxa" w:w="1800"/>
+          </w:tcPr>
+          <w:p>
+            <w:pPr>
+              <w:spacing w:after="0"/>
+            </w:pPr>
+            <w:r>
+              <w:rPr>
+                <w:rFonts w:ascii="Calibri" w:hAnsi="Calibri"/>
+                <w:b/>
+                <w:i w:val="0"/>
+                <w:color w:val="17324D"/>
+                <w:sz w:val="17"/>
+              </w:rPr>
+              <w:t>Design for belonging</w:t>
+            </w:r>
+          </w:p>
+        </w:tc>
+        <w:tc>
+          <w:tcPr>
+            <w:tcW w:type="dxa" w:w="4680"/>
+          </w:tcPr>
+          <w:p>
+            <w:pPr>
+              <w:spacing w:after="0"/>
+            </w:pPr>
+            <w:r>
+              <w:rPr>
+                <w:rFonts w:ascii="Calibri" w:hAnsi="Calibri"/>
+                <w:b w:val="0"/>
+                <w:i w:val="0"/>
+                <w:color w:val="18242F"/>
+                <w:sz w:val="17"/>
+              </w:rPr>
+              <w:t>Present the one-sport community-day scenario. Students propose two changes, justify them using evidence from their profile or cards, then exchange feedback: 'This may include more people because...' and 'A barrier still might be...'.</w:t>
             </w:r>
           </w:p>
         </w:tc>
@@ -475,8 +1195,18 @@
             <w:tcW w:type="dxa" w:w="2160"/>
           </w:tcPr>
           <w:p>
+            <w:pPr>
+              <w:spacing w:after="0"/>
+            </w:pPr>
             <w:r>
-              <w:t>Observe examples. Discuss with a partner. Share ideas.</w:t>
+              <w:rPr>
+                <w:rFonts w:ascii="Calibri" w:hAnsi="Calibri"/>
+                <w:b w:val="0"/>
+                <w:i w:val="0"/>
+                <w:color w:val="18242F"/>
+                <w:sz w:val="17"/>
+              </w:rPr>
+              <w:t>Require an immediate revision in a different-coloured pen or with a star.</w:t>
             </w:r>
           </w:p>
         </w:tc>
@@ -484,41 +1214,355 @@
       <w:tr>
         <w:tc>
           <w:tcPr>
-            <w:tcW w:type="dxa" w:w="2160"/>
+            <w:tcW w:type="dxa" w:w="720"/>
+            <w:shd w:fill="F4F7F8"/>
           </w:tcPr>
           <w:p>
+            <w:pPr>
+              <w:spacing w:after="0"/>
+            </w:pPr>
             <w:r>
-              <w:t>8 min</w:t>
+              <w:rPr>
+                <w:rFonts w:ascii="Calibri" w:hAnsi="Calibri"/>
+                <w:b w:val="0"/>
+                <w:i w:val="0"/>
+                <w:color w:val="18242F"/>
+                <w:sz w:val="17"/>
+              </w:rPr>
+              <w:t>54-60</w:t>
+            </w:r>
+          </w:p>
+        </w:tc>
+        <w:tc>
+          <w:tcPr>
+            <w:tcW w:type="dxa" w:w="1800"/>
+            <w:shd w:fill="F4F7F8"/>
+          </w:tcPr>
+          <w:p>
+            <w:pPr>
+              <w:spacing w:after="0"/>
+            </w:pPr>
+            <w:r>
+              <w:rPr>
+                <w:rFonts w:ascii="Calibri" w:hAnsi="Calibri"/>
+                <w:b/>
+                <w:i w:val="0"/>
+                <w:color w:val="17324D"/>
+                <w:sz w:val="17"/>
+              </w:rPr>
+              <w:t>Exit evidence</w:t>
+            </w:r>
+          </w:p>
+        </w:tc>
+        <w:tc>
+          <w:tcPr>
+            <w:tcW w:type="dxa" w:w="4680"/>
+            <w:shd w:fill="F4F7F8"/>
+          </w:tcPr>
+          <w:p>
+            <w:pPr>
+              <w:spacing w:after="0"/>
+            </w:pPr>
+            <w:r>
+              <w:rPr>
+                <w:rFonts w:ascii="Calibri" w:hAnsi="Calibri"/>
+                <w:b w:val="0"/>
+                <w:i w:val="0"/>
+                <w:color w:val="18242F"/>
+                <w:sz w:val="17"/>
+              </w:rPr>
+              <w:t>Students answer the claim-evidence-reasoning exit prompt. Collect workbooks. Sort responses after class into Ready / Developing / Reteach.</w:t>
             </w:r>
           </w:p>
         </w:tc>
         <w:tc>
           <w:tcPr>
             <w:tcW w:type="dxa" w:w="2160"/>
+            <w:shd w:fill="F4F7F8"/>
+          </w:tcPr>
+          <w:p>
+            <w:pPr>
+              <w:spacing w:after="0"/>
+            </w:pPr>
+            <w:r>
+              <w:rPr>
+                <w:rFonts w:ascii="Calibri" w:hAnsi="Calibri"/>
+                <w:b w:val="0"/>
+                <w:i w:val="0"/>
+                <w:color w:val="18242F"/>
+                <w:sz w:val="17"/>
+              </w:rPr>
+              <w:t>Use the sort to decide whether Week 2 needs a short recap on diversity, participation or wellbeing.</w:t>
+            </w:r>
+          </w:p>
+        </w:tc>
+      </w:tr>
+    </w:tbl>
+    <w:p>
+      <w:r>
+        <w:br w:type="page"/>
+      </w:r>
+    </w:p>
+    <w:p>
+      <w:pPr>
+        <w:spacing w:after="160"/>
+      </w:pPr>
+    </w:p>
+    <w:p>
+      <w:pPr>
+        <w:pStyle w:val="Heading1"/>
+      </w:pPr>
+      <w:r>
+        <w:t>Teacher talk and worked model</w:t>
+      </w:r>
+    </w:p>
+    <w:p>
+      <w:pPr>
+        <w:pStyle w:val="Heading2"/>
+      </w:pPr>
+      <w:r>
+        <w:t>Student-friendly definition</w:t>
+      </w:r>
+    </w:p>
+    <w:tbl>
+      <w:tblPr>
+        <w:tblW w:type="dxa" w:w="9360"/>
+        <w:tblLayout w:type="fixed"/>
+        <w:tblLook w:firstColumn="1" w:firstRow="1" w:lastColumn="0" w:lastRow="0" w:noHBand="0" w:noVBand="1" w:val="04A0"/>
+        <w:tblInd w:w="120" w:type="dxa"/>
+        <w:tblBorders>
+          <w:top w:val="single" w:sz="10" w:color="007C83"/>
+          <w:left w:val="single" w:sz="10" w:color="007C83"/>
+          <w:bottom w:val="single" w:sz="10" w:color="007C83"/>
+          <w:right w:val="single" w:sz="10" w:color="007C83"/>
+        </w:tblBorders>
+      </w:tblPr>
+      <w:tblGrid>
+        <w:gridCol w:w="9360"/>
+      </w:tblGrid>
+      <w:tr>
+        <w:tc>
+          <w:tcPr>
+            <w:tcW w:type="dxa" w:w="9360"/>
+            <w:tcMar>
+              <w:top w:w="90" w:type="dxa"/>
+              <w:start w:w="120" w:type="dxa"/>
+              <w:bottom w:w="90" w:type="dxa"/>
+              <w:end w:w="120" w:type="dxa"/>
+            </w:tcMar>
+            <w:vAlign w:val="center"/>
+            <w:shd w:fill="DDF3F1"/>
+          </w:tcPr>
+          <w:p>
+            <w:pPr>
+              <w:spacing w:after="0"/>
+            </w:pPr>
+            <w:r>
+              <w:rPr>
+                <w:rFonts w:ascii="Calibri" w:hAnsi="Calibri"/>
+                <w:b/>
+                <w:i w:val="0"/>
+                <w:color w:val="007C83"/>
+                <w:sz w:val="18"/>
+              </w:rPr>
+              <w:t xml:space="preserve">SAY  </w:t>
+            </w:r>
+            <w:r>
+              <w:rPr>
+                <w:rFonts w:ascii="Calibri" w:hAnsi="Calibri"/>
+                <w:b w:val="0"/>
+                <w:i w:val="0"/>
+                <w:color w:val="18242F"/>
+                <w:sz w:val="21"/>
+              </w:rPr>
+              <w:t>Physical activity is anything that gets your body moving and uses energy. It includes everyday movement, active travel, exercise, sport, strengthening and cultural movement practices.</w:t>
+            </w:r>
+          </w:p>
+        </w:tc>
+      </w:tr>
+    </w:tbl>
+    <w:p>
+      <w:pPr>
+        <w:spacing w:after="0"/>
+      </w:pPr>
+    </w:p>
+    <w:p>
+      <w:r>
+        <w:rPr>
+          <w:rFonts w:ascii="Calibri" w:hAnsi="Calibri"/>
+          <w:b/>
+          <w:i w:val="0"/>
+          <w:color w:val="52606D"/>
+          <w:sz w:val="18"/>
+        </w:rPr>
+        <w:t xml:space="preserve">Source: </w:t>
+      </w:r>
+      <w:hyperlink r:id="rId11">
+        <w:r>
+          <w:rPr>
+            <w:color w:val="007C83"/>
+            <w:u w:val="single"/>
+          </w:rPr>
+          <w:t>Australian Government - About physical activity</w:t>
+        </w:r>
+      </w:hyperlink>
+    </w:p>
+    <w:p>
+      <w:pPr>
+        <w:pStyle w:val="Heading2"/>
+      </w:pPr>
+      <w:r>
+        <w:t>Model profile entry</w:t>
+      </w:r>
+    </w:p>
+    <w:tbl>
+      <w:tblPr>
+        <w:tblW w:type="dxa" w:w="9360"/>
+        <w:tblLayout w:type="fixed"/>
+        <w:tblLook w:firstColumn="1" w:firstRow="1" w:lastColumn="0" w:lastRow="0" w:noHBand="0" w:noVBand="1" w:val="04A0"/>
+        <w:tblInd w:w="120" w:type="dxa"/>
+        <w:tblBorders>
+          <w:top w:val="single" w:sz="6" w:color="CBD5DC"/>
+          <w:left w:val="single" w:sz="6" w:color="CBD5DC"/>
+          <w:bottom w:val="single" w:sz="6" w:color="CBD5DC"/>
+          <w:right w:val="single" w:sz="6" w:color="CBD5DC"/>
+          <w:insideH w:val="single" w:sz="6" w:color="CBD5DC"/>
+          <w:insideV w:val="single" w:sz="6" w:color="CBD5DC"/>
+        </w:tblBorders>
+      </w:tblPr>
+      <w:tblGrid>
+        <w:gridCol w:w="1650"/>
+        <w:gridCol w:w="1400"/>
+        <w:gridCol w:w="1300"/>
+        <w:gridCol w:w="2510"/>
+        <w:gridCol w:w="2500"/>
+      </w:tblGrid>
+      <w:tr>
+        <w:trPr>
+          <w:tblHeader w:val="true"/>
+        </w:trPr>
+        <w:tc>
+          <w:tcPr>
+            <w:tcW w:type="dxa" w:w="1650"/>
+            <w:tcMar>
+              <w:top w:w="90" w:type="dxa"/>
+              <w:start w:w="120" w:type="dxa"/>
+              <w:bottom w:w="90" w:type="dxa"/>
+              <w:end w:w="120" w:type="dxa"/>
+            </w:tcMar>
+            <w:vAlign w:val="center"/>
+            <w:shd w:fill="007C83"/>
           </w:tcPr>
           <w:p>
             <w:r>
-              <w:t>Define</w:t>
+              <w:rPr>
+                <w:rFonts w:ascii="Calibri" w:hAnsi="Calibri"/>
+                <w:b/>
+                <w:i w:val="0"/>
+                <w:color w:val="FFFFFF"/>
+                <w:sz w:val="17"/>
+              </w:rPr>
+              <w:t>Activity</w:t>
             </w:r>
           </w:p>
         </w:tc>
         <w:tc>
           <w:tcPr>
-            <w:tcW w:type="dxa" w:w="2160"/>
+            <w:tcW w:type="dxa" w:w="1400"/>
+            <w:tcMar>
+              <w:top w:w="90" w:type="dxa"/>
+              <w:start w:w="120" w:type="dxa"/>
+              <w:bottom w:w="90" w:type="dxa"/>
+              <w:end w:w="120" w:type="dxa"/>
+            </w:tcMar>
+            <w:vAlign w:val="center"/>
+            <w:shd w:fill="007C83"/>
           </w:tcPr>
           <w:p>
             <w:r>
-              <w:t>Present definition of physical activity. Discuss: movement that uses energy, raises heart rate, strengthens body. Record student examples on board.</w:t>
+              <w:rPr>
+                <w:rFonts w:ascii="Calibri" w:hAnsi="Calibri"/>
+                <w:b/>
+                <w:i w:val="0"/>
+                <w:color w:val="FFFFFF"/>
+                <w:sz w:val="17"/>
+              </w:rPr>
+              <w:t>Where</w:t>
             </w:r>
           </w:p>
         </w:tc>
         <w:tc>
           <w:tcPr>
-            <w:tcW w:type="dxa" w:w="2160"/>
+            <w:tcW w:type="dxa" w:w="1300"/>
+            <w:tcMar>
+              <w:top w:w="90" w:type="dxa"/>
+              <w:start w:w="120" w:type="dxa"/>
+              <w:bottom w:w="90" w:type="dxa"/>
+              <w:end w:w="120" w:type="dxa"/>
+            </w:tcMar>
+            <w:vAlign w:val="center"/>
+            <w:shd w:fill="007C83"/>
           </w:tcPr>
           <w:p>
             <w:r>
-              <w:t>Contribute examples. Record definition on worksheet Activity 1.</w:t>
+              <w:rPr>
+                <w:rFonts w:ascii="Calibri" w:hAnsi="Calibri"/>
+                <w:b/>
+                <w:i w:val="0"/>
+                <w:color w:val="FFFFFF"/>
+                <w:sz w:val="17"/>
+              </w:rPr>
+              <w:t>How often</w:t>
+            </w:r>
+          </w:p>
+        </w:tc>
+        <w:tc>
+          <w:tcPr>
+            <w:tcW w:type="dxa" w:w="2510"/>
+            <w:tcMar>
+              <w:top w:w="90" w:type="dxa"/>
+              <w:start w:w="120" w:type="dxa"/>
+              <w:bottom w:w="90" w:type="dxa"/>
+              <w:end w:w="120" w:type="dxa"/>
+            </w:tcMar>
+            <w:vAlign w:val="center"/>
+            <w:shd w:fill="007C83"/>
+          </w:tcPr>
+          <w:p>
+            <w:r>
+              <w:rPr>
+                <w:rFonts w:ascii="Calibri" w:hAnsi="Calibri"/>
+                <w:b/>
+                <w:i w:val="0"/>
+                <w:color w:val="FFFFFF"/>
+                <w:sz w:val="17"/>
+              </w:rPr>
+              <w:t>Why I choose it</w:t>
+            </w:r>
+          </w:p>
+        </w:tc>
+        <w:tc>
+          <w:tcPr>
+            <w:tcW w:type="dxa" w:w="2500"/>
+            <w:tcMar>
+              <w:top w:w="90" w:type="dxa"/>
+              <w:start w:w="120" w:type="dxa"/>
+              <w:bottom w:w="90" w:type="dxa"/>
+              <w:end w:w="120" w:type="dxa"/>
+            </w:tcMar>
+            <w:vAlign w:val="center"/>
+            <w:shd w:fill="007C83"/>
+          </w:tcPr>
+          <w:p>
+            <w:r>
+              <w:rPr>
+                <w:rFonts w:ascii="Calibri" w:hAnsi="Calibri"/>
+                <w:b/>
+                <w:i w:val="0"/>
+                <w:color w:val="FFFFFF"/>
+                <w:sz w:val="17"/>
+              </w:rPr>
+              <w:t>What influences my choice</w:t>
             </w:r>
           </w:p>
         </w:tc>
@@ -526,41 +1570,350 @@
       <w:tr>
         <w:tc>
           <w:tcPr>
-            <w:tcW w:type="dxa" w:w="2160"/>
+            <w:tcW w:type="dxa" w:w="1650"/>
+            <w:tcMar>
+              <w:top w:w="90" w:type="dxa"/>
+              <w:start w:w="120" w:type="dxa"/>
+              <w:bottom w:w="90" w:type="dxa"/>
+              <w:end w:w="120" w:type="dxa"/>
+            </w:tcMar>
+            <w:vAlign w:val="center"/>
           </w:tcPr>
           <w:p>
             <w:r>
-              <w:t>12 min</w:t>
+              <w:rPr>
+                <w:rFonts w:ascii="Calibri" w:hAnsi="Calibri"/>
+                <w:b w:val="0"/>
+                <w:i w:val="0"/>
+                <w:color w:val="18242F"/>
+                <w:sz w:val="17"/>
+              </w:rPr>
+              <w:t>Walking the dog</w:t>
             </w:r>
           </w:p>
         </w:tc>
         <w:tc>
           <w:tcPr>
-            <w:tcW w:type="dxa" w:w="2160"/>
+            <w:tcW w:type="dxa" w:w="1400"/>
+            <w:tcMar>
+              <w:top w:w="90" w:type="dxa"/>
+              <w:start w:w="120" w:type="dxa"/>
+              <w:bottom w:w="90" w:type="dxa"/>
+              <w:end w:w="120" w:type="dxa"/>
+            </w:tcMar>
+            <w:vAlign w:val="center"/>
           </w:tcPr>
           <w:p>
             <w:r>
-              <w:t>My Activity</w:t>
+              <w:rPr>
+                <w:rFonts w:ascii="Calibri" w:hAnsi="Calibri"/>
+                <w:b w:val="0"/>
+                <w:i w:val="0"/>
+                <w:color w:val="18242F"/>
+                <w:sz w:val="17"/>
+              </w:rPr>
+              <w:t>Local streets</w:t>
             </w:r>
           </w:p>
         </w:tc>
         <w:tc>
           <w:tcPr>
-            <w:tcW w:type="dxa" w:w="2160"/>
+            <w:tcW w:type="dxa" w:w="1300"/>
+            <w:tcMar>
+              <w:top w:w="90" w:type="dxa"/>
+              <w:start w:w="120" w:type="dxa"/>
+              <w:bottom w:w="90" w:type="dxa"/>
+              <w:end w:w="120" w:type="dxa"/>
+            </w:tcMar>
+            <w:vAlign w:val="center"/>
           </w:tcPr>
           <w:p>
             <w:r>
-              <w:t>Distribute C2C My physical activity sheet. Guide students through reflecting on their own choices, locations, and reasons for participation.</w:t>
+              <w:rPr>
+                <w:rFonts w:ascii="Calibri" w:hAnsi="Calibri"/>
+                <w:b w:val="0"/>
+                <w:i w:val="0"/>
+                <w:color w:val="18242F"/>
+                <w:sz w:val="17"/>
+              </w:rPr>
+              <w:t>Most afternoons</w:t>
             </w:r>
           </w:p>
         </w:tc>
         <w:tc>
           <w:tcPr>
-            <w:tcW w:type="dxa" w:w="2160"/>
+            <w:tcW w:type="dxa" w:w="2510"/>
+            <w:tcMar>
+              <w:top w:w="90" w:type="dxa"/>
+              <w:start w:w="120" w:type="dxa"/>
+              <w:bottom w:w="90" w:type="dxa"/>
+              <w:end w:w="120" w:type="dxa"/>
+            </w:tcMar>
+            <w:vAlign w:val="center"/>
           </w:tcPr>
           <w:p>
             <w:r>
-              <w:t>Complete My physical activity sheet (kept for assessment). Begin Activity 2 on worksheet.</w:t>
+              <w:rPr>
+                <w:rFonts w:ascii="Calibri" w:hAnsi="Calibri"/>
+                <w:b w:val="0"/>
+                <w:i w:val="0"/>
+                <w:color w:val="18242F"/>
+                <w:sz w:val="17"/>
+              </w:rPr>
+              <w:t>Time together; fresh air; helps me reset</w:t>
+            </w:r>
+          </w:p>
+        </w:tc>
+        <w:tc>
+          <w:tcPr>
+            <w:tcW w:type="dxa" w:w="2500"/>
+            <w:tcMar>
+              <w:top w:w="90" w:type="dxa"/>
+              <w:start w:w="120" w:type="dxa"/>
+              <w:bottom w:w="90" w:type="dxa"/>
+              <w:end w:w="120" w:type="dxa"/>
+            </w:tcMar>
+            <w:vAlign w:val="center"/>
+          </w:tcPr>
+          <w:p>
+            <w:r>
+              <w:rPr>
+                <w:rFonts w:ascii="Calibri" w:hAnsi="Calibri"/>
+                <w:b w:val="0"/>
+                <w:i w:val="0"/>
+                <w:color w:val="18242F"/>
+                <w:sz w:val="17"/>
+              </w:rPr>
+              <w:t>Family routine; free access; weather</w:t>
+            </w:r>
+          </w:p>
+        </w:tc>
+      </w:tr>
+    </w:tbl>
+    <w:p>
+      <w:pPr>
+        <w:pStyle w:val="Heading2"/>
+      </w:pPr>
+      <w:r>
+        <w:t>Model community claim</w:t>
+      </w:r>
+    </w:p>
+    <w:tbl>
+      <w:tblPr>
+        <w:tblW w:type="dxa" w:w="9360"/>
+        <w:tblLayout w:type="fixed"/>
+        <w:tblLook w:firstColumn="1" w:firstRow="1" w:lastColumn="0" w:lastRow="0" w:noHBand="0" w:noVBand="1" w:val="04A0"/>
+        <w:tblInd w:w="120" w:type="dxa"/>
+        <w:tblBorders>
+          <w:top w:val="single" w:sz="10" w:color="C77D18"/>
+          <w:left w:val="single" w:sz="10" w:color="C77D18"/>
+          <w:bottom w:val="single" w:sz="10" w:color="C77D18"/>
+          <w:right w:val="single" w:sz="10" w:color="C77D18"/>
+        </w:tblBorders>
+      </w:tblPr>
+      <w:tblGrid>
+        <w:gridCol w:w="9360"/>
+      </w:tblGrid>
+      <w:tr>
+        <w:tc>
+          <w:tcPr>
+            <w:tcW w:type="dxa" w:w="9360"/>
+            <w:tcMar>
+              <w:top w:w="90" w:type="dxa"/>
+              <w:start w:w="120" w:type="dxa"/>
+              <w:bottom w:w="90" w:type="dxa"/>
+              <w:end w:w="120" w:type="dxa"/>
+            </w:tcMar>
+            <w:vAlign w:val="center"/>
+            <w:shd w:fill="FFF1D8"/>
+          </w:tcPr>
+          <w:p>
+            <w:pPr>
+              <w:spacing w:after="0"/>
+            </w:pPr>
+            <w:r>
+              <w:rPr>
+                <w:rFonts w:ascii="Calibri" w:hAnsi="Calibri"/>
+                <w:b/>
+                <w:i w:val="0"/>
+                <w:color w:val="C77D18"/>
+                <w:sz w:val="18"/>
+              </w:rPr>
+              <w:t xml:space="preserve">THINK ALOUD  </w:t>
+            </w:r>
+            <w:r>
+              <w:rPr>
+                <w:rFonts w:ascii="Calibri" w:hAnsi="Calibri"/>
+                <w:b w:val="0"/>
+                <w:i w:val="0"/>
+                <w:color w:val="18242F"/>
+                <w:sz w:val="21"/>
+              </w:rPr>
+              <w:t>Valuing different activities can strengthen belonging because people see that movement is not limited to one sport or one type of body. For example, including a gentle tai chi session and a team game gives people different ways to participate. Therefore, more people may feel that the event is for them.</w:t>
+            </w:r>
+          </w:p>
+        </w:tc>
+      </w:tr>
+    </w:tbl>
+    <w:p>
+      <w:pPr>
+        <w:spacing w:after="0"/>
+      </w:pPr>
+    </w:p>
+    <w:p>
+      <w:pPr>
+        <w:pStyle w:val="Heading2"/>
+      </w:pPr>
+      <w:r>
+        <w:t>Questions that deepen thinking</w:t>
+      </w:r>
+    </w:p>
+    <w:p>
+      <w:pPr>
+        <w:pStyle w:val="ListBullet"/>
+        <w:spacing w:after="80" w:line="276" w:lineRule="auto"/>
+        <w:ind w:left="720" w:hanging="360"/>
+      </w:pPr>
+      <w:r>
+        <w:rPr>
+          <w:rFonts w:ascii="Calibri" w:hAnsi="Calibri"/>
+          <w:b w:val="0"/>
+          <w:i w:val="0"/>
+          <w:color w:val="18242F"/>
+          <w:sz w:val="21"/>
+        </w:rPr>
+        <w:t>Whose interests or needs are visible in this activity? Whose might be missing?</w:t>
+      </w:r>
+    </w:p>
+    <w:p>
+      <w:pPr>
+        <w:pStyle w:val="ListBullet"/>
+        <w:spacing w:after="80" w:line="276" w:lineRule="auto"/>
+        <w:ind w:left="720" w:hanging="360"/>
+      </w:pPr>
+      <w:r>
+        <w:rPr>
+          <w:rFonts w:ascii="Calibri" w:hAnsi="Calibri"/>
+          <w:b w:val="0"/>
+          <w:i w:val="0"/>
+          <w:color w:val="18242F"/>
+          <w:sz w:val="21"/>
+        </w:rPr>
+        <w:t>Is a choice personal only, or is it also shaped by family, culture, cost, access, place or ability?</w:t>
+      </w:r>
+    </w:p>
+    <w:p>
+      <w:pPr>
+        <w:pStyle w:val="ListBullet"/>
+        <w:spacing w:after="80" w:line="276" w:lineRule="auto"/>
+        <w:ind w:left="720" w:hanging="360"/>
+      </w:pPr>
+      <w:r>
+        <w:rPr>
+          <w:rFonts w:ascii="Calibri" w:hAnsi="Calibri"/>
+          <w:b w:val="0"/>
+          <w:i w:val="0"/>
+          <w:color w:val="18242F"/>
+          <w:sz w:val="21"/>
+        </w:rPr>
+        <w:t>How does your evidence show respect rather than treating a culture as a costume or novelty?</w:t>
+      </w:r>
+    </w:p>
+    <w:p>
+      <w:pPr>
+        <w:pStyle w:val="ListBullet"/>
+        <w:spacing w:after="80" w:line="276" w:lineRule="auto"/>
+        <w:ind w:left="720" w:hanging="360"/>
+      </w:pPr>
+      <w:r>
+        <w:rPr>
+          <w:rFonts w:ascii="Calibri" w:hAnsi="Calibri"/>
+          <w:b w:val="0"/>
+          <w:i w:val="0"/>
+          <w:color w:val="18242F"/>
+          <w:sz w:val="21"/>
+        </w:rPr>
+        <w:t>What would participation, belonging or wellbeing look like here?</w:t>
+      </w:r>
+    </w:p>
+    <w:p>
+      <w:pPr>
+        <w:pStyle w:val="Heading2"/>
+      </w:pPr>
+      <w:r>
+        <w:t>Misconceptions and responses</w:t>
+      </w:r>
+    </w:p>
+    <w:tbl>
+      <w:tblPr>
+        <w:tblW w:type="dxa" w:w="9360"/>
+        <w:tblLayout w:type="fixed"/>
+        <w:tblLook w:firstColumn="1" w:firstRow="1" w:lastColumn="0" w:lastRow="0" w:noHBand="0" w:noVBand="1" w:val="04A0"/>
+        <w:tblInd w:w="120" w:type="dxa"/>
+        <w:tblBorders>
+          <w:top w:val="single" w:sz="6" w:color="CBD5DC"/>
+          <w:left w:val="single" w:sz="6" w:color="CBD5DC"/>
+          <w:bottom w:val="single" w:sz="6" w:color="CBD5DC"/>
+          <w:right w:val="single" w:sz="6" w:color="CBD5DC"/>
+          <w:insideH w:val="single" w:sz="6" w:color="CBD5DC"/>
+          <w:insideV w:val="single" w:sz="6" w:color="CBD5DC"/>
+        </w:tblBorders>
+      </w:tblPr>
+      <w:tblGrid>
+        <w:gridCol w:w="3900"/>
+        <w:gridCol w:w="5460"/>
+      </w:tblGrid>
+      <w:tr>
+        <w:trPr>
+          <w:tblHeader w:val="true"/>
+        </w:trPr>
+        <w:tc>
+          <w:tcPr>
+            <w:tcW w:type="dxa" w:w="3900"/>
+            <w:tcMar>
+              <w:top w:w="90" w:type="dxa"/>
+              <w:start w:w="120" w:type="dxa"/>
+              <w:bottom w:w="90" w:type="dxa"/>
+              <w:end w:w="120" w:type="dxa"/>
+            </w:tcMar>
+            <w:vAlign w:val="center"/>
+            <w:shd w:fill="FBE7E3"/>
+          </w:tcPr>
+          <w:p>
+            <w:r>
+              <w:rPr>
+                <w:rFonts w:ascii="Calibri" w:hAnsi="Calibri"/>
+                <w:b/>
+                <w:i w:val="0"/>
+                <w:color w:val="B64C3B"/>
+                <w:sz w:val="18"/>
+              </w:rPr>
+              <w:t>If students say...</w:t>
+            </w:r>
+          </w:p>
+        </w:tc>
+        <w:tc>
+          <w:tcPr>
+            <w:tcW w:type="dxa" w:w="5460"/>
+            <w:tcMar>
+              <w:top w:w="90" w:type="dxa"/>
+              <w:start w:w="120" w:type="dxa"/>
+              <w:bottom w:w="90" w:type="dxa"/>
+              <w:end w:w="120" w:type="dxa"/>
+            </w:tcMar>
+            <w:vAlign w:val="center"/>
+            <w:shd w:fill="FBE7E3"/>
+          </w:tcPr>
+          <w:p>
+            <w:r>
+              <w:rPr>
+                <w:rFonts w:ascii="Calibri" w:hAnsi="Calibri"/>
+                <w:b/>
+                <w:i w:val="0"/>
+                <w:color w:val="B64C3B"/>
+                <w:sz w:val="18"/>
+              </w:rPr>
+              <w:t>Respond with...</w:t>
             </w:r>
           </w:p>
         </w:tc>
@@ -568,41 +1921,35 @@
       <w:tr>
         <w:tc>
           <w:tcPr>
-            <w:tcW w:type="dxa" w:w="2160"/>
+            <w:tcW w:type="dxa" w:w="3900"/>
           </w:tcPr>
           <w:p>
             <w:r>
-              <w:t>10 min</w:t>
+              <w:rPr>
+                <w:rFonts w:ascii="Calibri" w:hAnsi="Calibri"/>
+                <w:b w:val="0"/>
+                <w:i w:val="0"/>
+                <w:color w:val="18242F"/>
+                <w:sz w:val="18"/>
+              </w:rPr>
+              <w:t>Only sport counts.</w:t>
             </w:r>
           </w:p>
         </w:tc>
         <w:tc>
           <w:tcPr>
-            <w:tcW w:type="dxa" w:w="2160"/>
+            <w:tcW w:type="dxa" w:w="5460"/>
           </w:tcPr>
           <w:p>
             <w:r>
-              <w:t>Alphabet Hunt</w:t>
-            </w:r>
-          </w:p>
-        </w:tc>
-        <w:tc>
-          <w:tcPr>
-            <w:tcW w:type="dxa" w:w="2160"/>
-          </w:tcPr>
-          <w:p>
-            <w:r>
-              <w:t>Introduce Physical activity alphabet. Model finding activities for 2–3 letters. Set challenge: find as many as possible in pairs.</w:t>
-            </w:r>
-          </w:p>
-        </w:tc>
-        <w:tc>
-          <w:tcPr>
-            <w:tcW w:type="dxa" w:w="2160"/>
-          </w:tcPr>
-          <w:p>
-            <w:r>
-              <w:t>Work in pairs on alphabet sheet and worksheet Activity 3.</w:t>
+              <w:rPr>
+                <w:rFonts w:ascii="Calibri" w:hAnsi="Calibri"/>
+                <w:b w:val="0"/>
+                <w:i w:val="0"/>
+                <w:color w:val="18242F"/>
+                <w:sz w:val="18"/>
+              </w:rPr>
+              <w:t>Test everyday movement, active travel, dance and cultural games against the definition.</w:t>
             </w:r>
           </w:p>
         </w:tc>
@@ -610,41 +1957,35 @@
       <w:tr>
         <w:tc>
           <w:tcPr>
-            <w:tcW w:type="dxa" w:w="2160"/>
+            <w:tcW w:type="dxa" w:w="3900"/>
           </w:tcPr>
           <w:p>
             <w:r>
-              <w:t>12 min</w:t>
+              <w:rPr>
+                <w:rFonts w:ascii="Calibri" w:hAnsi="Calibri"/>
+                <w:b w:val="0"/>
+                <w:i w:val="0"/>
+                <w:color w:val="18242F"/>
+                <w:sz w:val="18"/>
+              </w:rPr>
+              <w:t>People choose freely, so access does not matter.</w:t>
             </w:r>
           </w:p>
         </w:tc>
         <w:tc>
           <w:tcPr>
-            <w:tcW w:type="dxa" w:w="2160"/>
+            <w:tcW w:type="dxa" w:w="5460"/>
           </w:tcPr>
           <w:p>
             <w:r>
-              <w:t>Cultural Games</w:t>
-            </w:r>
-          </w:p>
-        </w:tc>
-        <w:tc>
-          <w:tcPr>
-            <w:tcW w:type="dxa" w:w="2160"/>
-          </w:tcPr>
-          <w:p>
-            <w:r>
-              <w:t>Present Indigenous games (Dabi, Edor, Keentan, Wana Wana) and Tai chi using slides. Discuss respect and cultural significance. Optional: short demo or video.</w:t>
-            </w:r>
-          </w:p>
-        </w:tc>
-        <w:tc>
-          <w:tcPr>
-            <w:tcW w:type="dxa" w:w="2160"/>
-          </w:tcPr>
-          <w:p>
-            <w:r>
-              <w:t>Complete Activity 4: cultural activity research. Note origin and how game is played.</w:t>
+              <w:rPr>
+                <w:rFonts w:ascii="Calibri" w:hAnsi="Calibri"/>
+                <w:b w:val="0"/>
+                <w:i w:val="0"/>
+                <w:color w:val="18242F"/>
+                <w:sz w:val="18"/>
+              </w:rPr>
+              <w:t>Ask how cost, transport, facilities, safety, family and ability shape available choices.</w:t>
             </w:r>
           </w:p>
         </w:tc>
@@ -652,41 +1993,35 @@
       <w:tr>
         <w:tc>
           <w:tcPr>
-            <w:tcW w:type="dxa" w:w="2160"/>
+            <w:tcW w:type="dxa" w:w="3900"/>
           </w:tcPr>
           <w:p>
             <w:r>
-              <w:t>8 min</w:t>
+              <w:rPr>
+                <w:rFonts w:ascii="Calibri" w:hAnsi="Calibri"/>
+                <w:b w:val="0"/>
+                <w:i w:val="0"/>
+                <w:color w:val="18242F"/>
+                <w:sz w:val="18"/>
+              </w:rPr>
+              <w:t>One game represents all First Nations peoples.</w:t>
             </w:r>
           </w:p>
         </w:tc>
         <w:tc>
           <w:tcPr>
-            <w:tcW w:type="dxa" w:w="2160"/>
+            <w:tcW w:type="dxa" w:w="5460"/>
           </w:tcPr>
           <w:p>
             <w:r>
-              <w:t>Diversity &amp; Community</w:t>
-            </w:r>
-          </w:p>
-        </w:tc>
-        <w:tc>
-          <w:tcPr>
-            <w:tcW w:type="dxa" w:w="2160"/>
-          </w:tcPr>
-          <w:p>
-            <w:r>
-              <w:t>Facilitate discussion: How does physical activity bring different groups together? Use school/community examples.</w:t>
-            </w:r>
-          </w:p>
-        </w:tc>
-        <w:tc>
-          <w:tcPr>
-            <w:tcW w:type="dxa" w:w="2160"/>
-          </w:tcPr>
-          <w:p>
-            <w:r>
-              <w:t>Complete Activity 5: groups working together. Think-pair-share.</w:t>
+              <w:rPr>
+                <w:rFonts w:ascii="Calibri" w:hAnsi="Calibri"/>
+                <w:b w:val="0"/>
+                <w:i w:val="0"/>
+                <w:color w:val="18242F"/>
+                <w:sz w:val="18"/>
+              </w:rPr>
+              <w:t>Name the specific community or region and emphasise the diversity of Aboriginal and Torres Strait Islander cultures.</w:t>
             </w:r>
           </w:p>
         </w:tc>
@@ -694,133 +2029,578 @@
       <w:tr>
         <w:tc>
           <w:tcPr>
-            <w:tcW w:type="dxa" w:w="2160"/>
+            <w:tcW w:type="dxa" w:w="3900"/>
           </w:tcPr>
           <w:p>
             <w:r>
-              <w:t>5 min</w:t>
+              <w:rPr>
+                <w:rFonts w:ascii="Calibri" w:hAnsi="Calibri"/>
+                <w:b w:val="0"/>
+                <w:i w:val="0"/>
+                <w:color w:val="18242F"/>
+                <w:sz w:val="18"/>
+              </w:rPr>
+              <w:t>Diversity is just having many options.</w:t>
             </w:r>
           </w:p>
         </w:tc>
         <w:tc>
           <w:tcPr>
-            <w:tcW w:type="dxa" w:w="2160"/>
+            <w:tcW w:type="dxa" w:w="5460"/>
           </w:tcPr>
           <w:p>
             <w:r>
-              <w:t>Reflect &amp; Wrap Up</w:t>
+              <w:rPr>
+                <w:rFonts w:ascii="Calibri" w:hAnsi="Calibri"/>
+                <w:b w:val="0"/>
+                <w:i w:val="0"/>
+                <w:color w:val="18242F"/>
+                <w:sz w:val="18"/>
+              </w:rPr>
+              <w:t>Add the valuing test: are differences respected, included and used to shape decisions?</w:t>
+            </w:r>
+          </w:p>
+        </w:tc>
+      </w:tr>
+    </w:tbl>
+    <w:p>
+      <w:r>
+        <w:br w:type="page"/>
+      </w:r>
+    </w:p>
+    <w:p>
+      <w:pPr>
+        <w:pStyle w:val="Heading1"/>
+      </w:pPr>
+      <w:r>
+        <w:t>Differentiation without changing the goal</w:t>
+      </w:r>
+    </w:p>
+    <w:tbl>
+      <w:tblPr>
+        <w:tblW w:type="dxa" w:w="9360"/>
+        <w:tblLayout w:type="fixed"/>
+        <w:tblLook w:firstColumn="1" w:firstRow="1" w:lastColumn="0" w:lastRow="0" w:noHBand="0" w:noVBand="1" w:val="04A0"/>
+        <w:tblInd w:w="120" w:type="dxa"/>
+        <w:tblBorders>
+          <w:top w:val="single" w:sz="8" w:color="007C83"/>
+          <w:left w:val="single" w:sz="8" w:color="007C83"/>
+          <w:bottom w:val="single" w:sz="8" w:color="007C83"/>
+          <w:right w:val="single" w:sz="8" w:color="007C83"/>
+        </w:tblBorders>
+      </w:tblPr>
+      <w:tblGrid>
+        <w:gridCol w:w="9360"/>
+      </w:tblGrid>
+      <w:tr>
+        <w:tc>
+          <w:tcPr>
+            <w:tcW w:type="dxa" w:w="9360"/>
+            <w:tcMar>
+              <w:top w:w="90" w:type="dxa"/>
+              <w:start w:w="120" w:type="dxa"/>
+              <w:bottom w:w="90" w:type="dxa"/>
+              <w:end w:w="120" w:type="dxa"/>
+            </w:tcMar>
+            <w:vAlign w:val="center"/>
+            <w:shd w:fill="DDF3F1"/>
+          </w:tcPr>
+          <w:p>
+            <w:r>
+              <w:rPr>
+                <w:rFonts w:ascii="Calibri" w:hAnsi="Calibri"/>
+                <w:b/>
+                <w:i w:val="0"/>
+                <w:color w:val="17324D"/>
+                <w:sz w:val="22"/>
+              </w:rPr>
+              <w:t>Support</w:t>
+            </w:r>
+          </w:p>
+          <w:p>
+            <w:pPr>
+              <w:pStyle w:val="ListBullet"/>
+              <w:spacing w:after="60"/>
+            </w:pPr>
+            <w:r>
+              <w:rPr>
+                <w:rFonts w:ascii="Calibri" w:hAnsi="Calibri"/>
+                <w:b w:val="0"/>
+                <w:i w:val="0"/>
+                <w:color w:val="18242F"/>
+                <w:sz w:val="19"/>
+              </w:rPr>
+              <w:t>Offer the word bank: fun, friendship, fitness, family, culture, calm, challenge, cost, access, safety, belonging.</w:t>
+            </w:r>
+          </w:p>
+          <w:p>
+            <w:pPr>
+              <w:pStyle w:val="ListBullet"/>
+              <w:spacing w:after="60"/>
+            </w:pPr>
+            <w:r>
+              <w:rPr>
+                <w:rFonts w:ascii="Calibri" w:hAnsi="Calibri"/>
+                <w:b w:val="0"/>
+                <w:i w:val="0"/>
+                <w:color w:val="18242F"/>
+                <w:sz w:val="19"/>
+              </w:rPr>
+              <w:t>Allow the personal profile to be dictated, drawn or completed with an adult scribe.</w:t>
+            </w:r>
+          </w:p>
+          <w:p>
+            <w:pPr>
+              <w:pStyle w:val="ListBullet"/>
+              <w:spacing w:after="60"/>
+            </w:pPr>
+            <w:r>
+              <w:rPr>
+                <w:rFonts w:ascii="Calibri" w:hAnsi="Calibri"/>
+                <w:b w:val="0"/>
+                <w:i w:val="0"/>
+                <w:color w:val="18242F"/>
+                <w:sz w:val="19"/>
+              </w:rPr>
+              <w:t>Give one evidence card with key sentences highlighted and use the oral briefing before written notes.</w:t>
+            </w:r>
+          </w:p>
+          <w:p>
+            <w:pPr>
+              <w:pStyle w:val="ListBullet"/>
+              <w:spacing w:after="60"/>
+            </w:pPr>
+            <w:r>
+              <w:rPr>
+                <w:rFonts w:ascii="Calibri" w:hAnsi="Calibri"/>
+                <w:b w:val="0"/>
+                <w:i w:val="0"/>
+                <w:color w:val="18242F"/>
+                <w:sz w:val="19"/>
+              </w:rPr>
+              <w:t>Use the claim frame: Valuing ___ can improve ___ because ___. For example, ___.</w:t>
+            </w:r>
+          </w:p>
+        </w:tc>
+      </w:tr>
+    </w:tbl>
+    <w:p>
+      <w:pPr>
+        <w:spacing w:after="0"/>
+      </w:pPr>
+    </w:p>
+    <w:tbl>
+      <w:tblPr>
+        <w:tblW w:type="dxa" w:w="9360"/>
+        <w:tblLayout w:type="fixed"/>
+        <w:tblLook w:firstColumn="1" w:firstRow="1" w:lastColumn="0" w:lastRow="0" w:noHBand="0" w:noVBand="1" w:val="04A0"/>
+        <w:tblInd w:w="120" w:type="dxa"/>
+        <w:tblBorders>
+          <w:top w:val="single" w:sz="8" w:color="007C83"/>
+          <w:left w:val="single" w:sz="8" w:color="007C83"/>
+          <w:bottom w:val="single" w:sz="8" w:color="007C83"/>
+          <w:right w:val="single" w:sz="8" w:color="007C83"/>
+        </w:tblBorders>
+      </w:tblPr>
+      <w:tblGrid>
+        <w:gridCol w:w="9360"/>
+      </w:tblGrid>
+      <w:tr>
+        <w:tc>
+          <w:tcPr>
+            <w:tcW w:type="dxa" w:w="9360"/>
+            <w:tcMar>
+              <w:top w:w="90" w:type="dxa"/>
+              <w:start w:w="120" w:type="dxa"/>
+              <w:bottom w:w="90" w:type="dxa"/>
+              <w:end w:w="120" w:type="dxa"/>
+            </w:tcMar>
+            <w:vAlign w:val="center"/>
+            <w:shd w:fill="FFF1D8"/>
+          </w:tcPr>
+          <w:p>
+            <w:r>
+              <w:rPr>
+                <w:rFonts w:ascii="Calibri" w:hAnsi="Calibri"/>
+                <w:b/>
+                <w:i w:val="0"/>
+                <w:color w:val="17324D"/>
+                <w:sz w:val="22"/>
+              </w:rPr>
+              <w:t>ICP / accessible pathway</w:t>
+            </w:r>
+          </w:p>
+          <w:p>
+            <w:pPr>
+              <w:pStyle w:val="ListBullet"/>
+              <w:spacing w:after="60"/>
+            </w:pPr>
+            <w:r>
+              <w:rPr>
+                <w:rFonts w:ascii="Calibri" w:hAnsi="Calibri"/>
+                <w:b w:val="0"/>
+                <w:i w:val="0"/>
+                <w:color w:val="18242F"/>
+                <w:sz w:val="19"/>
+              </w:rPr>
+              <w:t>Use photo, symbol, spoken or partner-assisted responses while retaining the same concept: choices, evidence and community inclusion.</w:t>
+            </w:r>
+          </w:p>
+          <w:p>
+            <w:pPr>
+              <w:pStyle w:val="ListBullet"/>
+              <w:spacing w:after="60"/>
+            </w:pPr>
+            <w:r>
+              <w:rPr>
+                <w:rFonts w:ascii="Calibri" w:hAnsi="Calibri"/>
+                <w:b w:val="0"/>
+                <w:i w:val="0"/>
+                <w:color w:val="18242F"/>
+                <w:sz w:val="19"/>
+              </w:rPr>
+              <w:t>Offer seated, low-impact and non-competitive examples without presenting them as lesser alternatives.</w:t>
+            </w:r>
+          </w:p>
+          <w:p>
+            <w:pPr>
+              <w:pStyle w:val="ListBullet"/>
+              <w:spacing w:after="60"/>
+            </w:pPr>
+            <w:r>
+              <w:rPr>
+                <w:rFonts w:ascii="Calibri" w:hAnsi="Calibri"/>
+                <w:b w:val="0"/>
+                <w:i w:val="0"/>
+                <w:color w:val="18242F"/>
+                <w:sz w:val="19"/>
+              </w:rPr>
+              <w:t>Pre-teach origin, community, movement and belonging with four icons; let the student select evidence and explain orally.</w:t>
+            </w:r>
+          </w:p>
+          <w:p>
+            <w:pPr>
+              <w:pStyle w:val="ListBullet"/>
+              <w:spacing w:after="60"/>
+            </w:pPr>
+            <w:r>
+              <w:rPr>
+                <w:rFonts w:ascii="Calibri" w:hAnsi="Calibri"/>
+                <w:b w:val="0"/>
+                <w:i w:val="0"/>
+                <w:color w:val="18242F"/>
+                <w:sz w:val="19"/>
+              </w:rPr>
+              <w:t>Follow documented student adjustments and sensory/movement safety plans.</w:t>
+            </w:r>
+          </w:p>
+        </w:tc>
+      </w:tr>
+    </w:tbl>
+    <w:p>
+      <w:pPr>
+        <w:spacing w:after="0"/>
+      </w:pPr>
+    </w:p>
+    <w:tbl>
+      <w:tblPr>
+        <w:tblW w:type="dxa" w:w="9360"/>
+        <w:tblLayout w:type="fixed"/>
+        <w:tblLook w:firstColumn="1" w:firstRow="1" w:lastColumn="0" w:lastRow="0" w:noHBand="0" w:noVBand="1" w:val="04A0"/>
+        <w:tblInd w:w="120" w:type="dxa"/>
+        <w:tblBorders>
+          <w:top w:val="single" w:sz="8" w:color="B64C3B"/>
+          <w:left w:val="single" w:sz="8" w:color="B64C3B"/>
+          <w:bottom w:val="single" w:sz="8" w:color="B64C3B"/>
+          <w:right w:val="single" w:sz="8" w:color="B64C3B"/>
+        </w:tblBorders>
+      </w:tblPr>
+      <w:tblGrid>
+        <w:gridCol w:w="9360"/>
+      </w:tblGrid>
+      <w:tr>
+        <w:tc>
+          <w:tcPr>
+            <w:tcW w:type="dxa" w:w="9360"/>
+            <w:tcMar>
+              <w:top w:w="90" w:type="dxa"/>
+              <w:start w:w="120" w:type="dxa"/>
+              <w:bottom w:w="90" w:type="dxa"/>
+              <w:end w:w="120" w:type="dxa"/>
+            </w:tcMar>
+            <w:vAlign w:val="center"/>
+            <w:shd w:fill="FBE7E3"/>
+          </w:tcPr>
+          <w:p>
+            <w:r>
+              <w:rPr>
+                <w:rFonts w:ascii="Calibri" w:hAnsi="Calibri"/>
+                <w:b/>
+                <w:i w:val="0"/>
+                <w:color w:val="17324D"/>
+                <w:sz w:val="22"/>
+              </w:rPr>
+              <w:t>Extend</w:t>
+            </w:r>
+          </w:p>
+          <w:p>
+            <w:pPr>
+              <w:pStyle w:val="ListBullet"/>
+              <w:spacing w:after="60"/>
+            </w:pPr>
+            <w:r>
+              <w:rPr>
+                <w:rFonts w:ascii="Calibri" w:hAnsi="Calibri"/>
+                <w:b w:val="0"/>
+                <w:i w:val="0"/>
+                <w:color w:val="18242F"/>
+                <w:sz w:val="19"/>
+              </w:rPr>
+              <w:t>Ask whether adding options is enough if cost, language, transport or confidence still blocks participation.</w:t>
+            </w:r>
+          </w:p>
+          <w:p>
+            <w:pPr>
+              <w:pStyle w:val="ListBullet"/>
+              <w:spacing w:after="60"/>
+            </w:pPr>
+            <w:r>
+              <w:rPr>
+                <w:rFonts w:ascii="Calibri" w:hAnsi="Calibri"/>
+                <w:b w:val="0"/>
+                <w:i w:val="0"/>
+                <w:color w:val="18242F"/>
+                <w:sz w:val="19"/>
+              </w:rPr>
+              <w:t>Require a counterexample: when might an activity with diverse participants still fail to value diversity?</w:t>
+            </w:r>
+          </w:p>
+          <w:p>
+            <w:pPr>
+              <w:pStyle w:val="ListBullet"/>
+              <w:spacing w:after="60"/>
+            </w:pPr>
+            <w:r>
+              <w:rPr>
+                <w:rFonts w:ascii="Calibri" w:hAnsi="Calibri"/>
+                <w:b w:val="0"/>
+                <w:i w:val="0"/>
+                <w:color w:val="18242F"/>
+                <w:sz w:val="19"/>
+              </w:rPr>
+              <w:t>Ask students to distinguish cultural appreciation, accurate attribution and tokenism in the proposed event.</w:t>
+            </w:r>
+          </w:p>
+        </w:tc>
+      </w:tr>
+    </w:tbl>
+    <w:p>
+      <w:pPr>
+        <w:spacing w:after="0"/>
+      </w:pPr>
+    </w:p>
+    <w:p>
+      <w:pPr>
+        <w:pStyle w:val="Heading1"/>
+      </w:pPr>
+      <w:r>
+        <w:t>Safety and cultural responsibility</w:t>
+      </w:r>
+    </w:p>
+    <w:p>
+      <w:pPr>
+        <w:pStyle w:val="ListBullet"/>
+        <w:spacing w:after="80" w:line="276" w:lineRule="auto"/>
+        <w:ind w:left="720" w:hanging="360"/>
+      </w:pPr>
+      <w:r>
+        <w:rPr>
+          <w:rFonts w:ascii="Calibri" w:hAnsi="Calibri"/>
+          <w:b w:val="0"/>
+          <w:i w:val="0"/>
+          <w:color w:val="18242F"/>
+          <w:sz w:val="21"/>
+        </w:rPr>
+        <w:t>Use only soft equipment for demonstrations; define boundaries; prohibit body contact; keep bats below waist height and balls below knee height for Dabi.</w:t>
+      </w:r>
+    </w:p>
+    <w:p>
+      <w:pPr>
+        <w:pStyle w:val="ListBullet"/>
+        <w:spacing w:after="80" w:line="276" w:lineRule="auto"/>
+        <w:ind w:left="720" w:hanging="360"/>
+      </w:pPr>
+      <w:r>
+        <w:rPr>
+          <w:rFonts w:ascii="Calibri" w:hAnsi="Calibri"/>
+          <w:b w:val="0"/>
+          <w:i w:val="0"/>
+          <w:color w:val="18242F"/>
+          <w:sz w:val="21"/>
+        </w:rPr>
+        <w:t>Do not run Edor without a large clear area and a specific risk check. The core lesson can be completed through evidence cards without game play.</w:t>
+      </w:r>
+    </w:p>
+    <w:p>
+      <w:pPr>
+        <w:pStyle w:val="ListBullet"/>
+        <w:spacing w:after="80" w:line="276" w:lineRule="auto"/>
+        <w:ind w:left="720" w:hanging="360"/>
+      </w:pPr>
+      <w:r>
+        <w:rPr>
+          <w:rFonts w:ascii="Calibri" w:hAnsi="Calibri"/>
+          <w:b w:val="0"/>
+          <w:i w:val="0"/>
+          <w:color w:val="18242F"/>
+          <w:sz w:val="21"/>
+        </w:rPr>
+        <w:t>Present the Yulunga activities as researched and adapted school versions, not as a complete representation of a living culture.</w:t>
+      </w:r>
+    </w:p>
+    <w:p>
+      <w:pPr>
+        <w:pStyle w:val="ListBullet"/>
+        <w:spacing w:after="80" w:line="276" w:lineRule="auto"/>
+        <w:ind w:left="720" w:hanging="360"/>
+      </w:pPr>
+      <w:r>
+        <w:rPr>
+          <w:rFonts w:ascii="Calibri" w:hAnsi="Calibri"/>
+          <w:b w:val="0"/>
+          <w:i w:val="0"/>
+          <w:color w:val="18242F"/>
+          <w:sz w:val="21"/>
+        </w:rPr>
+        <w:t>Follow the ASC recommendation to inform or invite local Elders or First Nations groups where these games are used in a school program.</w:t>
+      </w:r>
+    </w:p>
+    <w:p>
+      <w:pPr>
+        <w:pStyle w:val="ListBullet"/>
+        <w:spacing w:after="80" w:line="276" w:lineRule="auto"/>
+        <w:ind w:left="720" w:hanging="360"/>
+      </w:pPr>
+      <w:r>
+        <w:rPr>
+          <w:rFonts w:ascii="Calibri" w:hAnsi="Calibri"/>
+          <w:b w:val="0"/>
+          <w:i w:val="0"/>
+          <w:color w:val="18242F"/>
+          <w:sz w:val="21"/>
+        </w:rPr>
+        <w:t>Avoid asking students to disclose culture, disability, family finances or health information. Personal-profile responses may remain private.</w:t>
+      </w:r>
+    </w:p>
+    <w:p>
+      <w:r>
+        <w:br w:type="page"/>
+      </w:r>
+    </w:p>
+    <w:p>
+      <w:pPr>
+        <w:pStyle w:val="Heading1"/>
+      </w:pPr>
+      <w:r>
+        <w:t>Formative assessment sort</w:t>
+      </w:r>
+    </w:p>
+    <w:tbl>
+      <w:tblPr>
+        <w:tblW w:type="dxa" w:w="9360"/>
+        <w:tblLayout w:type="fixed"/>
+        <w:tblLook w:firstColumn="1" w:firstRow="1" w:lastColumn="0" w:lastRow="0" w:noHBand="0" w:noVBand="1" w:val="04A0"/>
+        <w:tblInd w:w="120" w:type="dxa"/>
+        <w:tblBorders>
+          <w:top w:val="single" w:sz="6" w:color="CBD5DC"/>
+          <w:left w:val="single" w:sz="6" w:color="CBD5DC"/>
+          <w:bottom w:val="single" w:sz="6" w:color="CBD5DC"/>
+          <w:right w:val="single" w:sz="6" w:color="CBD5DC"/>
+          <w:insideH w:val="single" w:sz="6" w:color="CBD5DC"/>
+          <w:insideV w:val="single" w:sz="6" w:color="CBD5DC"/>
+        </w:tblBorders>
+      </w:tblPr>
+      <w:tblGrid>
+        <w:gridCol w:w="3120"/>
+        <w:gridCol w:w="3120"/>
+        <w:gridCol w:w="3120"/>
+      </w:tblGrid>
+      <w:tr>
+        <w:trPr>
+          <w:tblHeader w:val="true"/>
+        </w:trPr>
+        <w:tc>
+          <w:tcPr>
+            <w:tcW w:type="dxa" w:w="3120"/>
+            <w:tcMar>
+              <w:top w:w="90" w:type="dxa"/>
+              <w:start w:w="120" w:type="dxa"/>
+              <w:bottom w:w="90" w:type="dxa"/>
+              <w:end w:w="120" w:type="dxa"/>
+            </w:tcMar>
+            <w:vAlign w:val="center"/>
+            <w:shd w:fill="DDF3F1"/>
+          </w:tcPr>
+          <w:p>
+            <w:r>
+              <w:rPr>
+                <w:rFonts w:ascii="Calibri" w:hAnsi="Calibri"/>
+                <w:b/>
+                <w:i w:val="0"/>
+                <w:color w:val="17324D"/>
+                <w:sz w:val="20"/>
+              </w:rPr>
+              <w:t>Ready</w:t>
             </w:r>
           </w:p>
         </w:tc>
         <w:tc>
           <w:tcPr>
-            <w:tcW w:type="dxa" w:w="2160"/>
+            <w:tcW w:type="dxa" w:w="3120"/>
+            <w:tcMar>
+              <w:top w:w="90" w:type="dxa"/>
+              <w:start w:w="120" w:type="dxa"/>
+              <w:bottom w:w="90" w:type="dxa"/>
+              <w:end w:w="120" w:type="dxa"/>
+            </w:tcMar>
+            <w:vAlign w:val="center"/>
+            <w:shd w:fill="FFF1D8"/>
           </w:tcPr>
           <w:p>
             <w:r>
-              <w:t>Exit ticket: one way diversity in physical activity supports community wellbeing. Preview Week 2 data collection.</w:t>
+              <w:rPr>
+                <w:rFonts w:ascii="Calibri" w:hAnsi="Calibri"/>
+                <w:b/>
+                <w:i w:val="0"/>
+                <w:color w:val="17324D"/>
+                <w:sz w:val="20"/>
+              </w:rPr>
+              <w:t>Developing</w:t>
             </w:r>
           </w:p>
         </w:tc>
         <w:tc>
           <w:tcPr>
-            <w:tcW w:type="dxa" w:w="2160"/>
+            <w:tcW w:type="dxa" w:w="3120"/>
+            <w:tcMar>
+              <w:top w:w="90" w:type="dxa"/>
+              <w:start w:w="120" w:type="dxa"/>
+              <w:bottom w:w="90" w:type="dxa"/>
+              <w:end w:w="120" w:type="dxa"/>
+            </w:tcMar>
+            <w:vAlign w:val="center"/>
+            <w:shd w:fill="FBE7E3"/>
           </w:tcPr>
           <w:p>
             <w:r>
-              <w:t>Complete exit ticket. Listen to preview.</w:t>
-            </w:r>
-          </w:p>
-        </w:tc>
-      </w:tr>
-    </w:tbl>
-    <w:p/>
-    <w:p>
-      <w:r>
-        <w:rPr>
-          <w:b/>
-          <w:sz w:val="24"/>
-        </w:rPr>
-        <w:t>Assessment Opportunities</w:t>
-      </w:r>
-    </w:p>
-    <w:p>
-      <w:pPr>
-        <w:pStyle w:val="ListBullet"/>
-      </w:pPr>
-      <w:r>
-        <w:t>My physical activity sheet — assessment evidence (formative monitoring; required for summative task)</w:t>
-      </w:r>
-    </w:p>
-    <w:p>
-      <w:pPr>
-        <w:pStyle w:val="ListBullet"/>
-      </w:pPr>
-      <w:r>
-        <w:t>Observe participation during cultural games discussion</w:t>
-      </w:r>
-    </w:p>
-    <w:p>
-      <w:pPr>
-        <w:pStyle w:val="ListBullet"/>
-      </w:pPr>
-      <w:r>
-        <w:t>Review worksheet Activities 1–5 for understanding</w:t>
-      </w:r>
-    </w:p>
-    <w:p>
-      <w:pPr>
-        <w:pStyle w:val="ListBullet"/>
-      </w:pPr>
-      <w:r>
-        <w:t>Exit ticket gauges understanding of diversity and community wellbeing</w:t>
-      </w:r>
-    </w:p>
-    <w:p>
-      <w:r>
-        <w:t>Evidence of learning: Can the student identify their motivation for participation? Can they state an example where different groups participate together in physical activity?</w:t>
-      </w:r>
-    </w:p>
-    <w:p/>
-    <w:p>
-      <w:r>
-        <w:rPr>
-          <w:b/>
-          <w:sz w:val="24"/>
-        </w:rPr>
-        <w:t>Differentiation Strategies</w:t>
-      </w:r>
-    </w:p>
-    <w:tbl>
-      <w:tblPr>
-        <w:tblStyle w:val="TableGrid"/>
-        <w:tblW w:type="auto" w:w="0"/>
-        <w:tblLook w:firstColumn="1" w:firstRow="1" w:lastColumn="0" w:lastRow="0" w:noHBand="0" w:noVBand="1" w:val="04A0"/>
-      </w:tblPr>
-      <w:tblGrid>
-        <w:gridCol w:w="4320"/>
-        <w:gridCol w:w="4320"/>
-      </w:tblGrid>
-      <w:tr>
-        <w:tc>
-          <w:tcPr>
-            <w:tcW w:type="dxa" w:w="4320"/>
-            <w:shd w:fill="E2EFDA" w:val="clear"/>
-          </w:tcPr>
-          <w:p>
-            <w:r>
-              <w:t>Support</w:t>
-            </w:r>
-          </w:p>
-        </w:tc>
-        <w:tc>
-          <w:tcPr>
-            <w:tcW w:type="dxa" w:w="4320"/>
-            <w:shd w:fill="FCE4D6" w:val="clear"/>
-          </w:tcPr>
-          <w:p>
-            <w:r>
-              <w:t>Extension</w:t>
+              <w:rPr>
+                <w:rFonts w:ascii="Calibri" w:hAnsi="Calibri"/>
+                <w:b/>
+                <w:i w:val="0"/>
+                <w:color w:val="17324D"/>
+                <w:sz w:val="20"/>
+              </w:rPr>
+              <w:t>Reteach</w:t>
             </w:r>
           </w:p>
         </w:tc>
@@ -828,110 +2608,182 @@
       <w:tr>
         <w:tc>
           <w:tcPr>
-            <w:tcW w:type="dxa" w:w="4320"/>
+            <w:tcW w:type="dxa" w:w="3120"/>
           </w:tcPr>
           <w:p>
             <w:r>
-              <w:t>• Provide sentence starters for written responses</w:t>
-              <w:br/>
-              <w:t>• Pre-fill alphabet examples for A–C to model</w:t>
-              <w:br/>
-              <w:t>• Pair with a peer mentor during alphabet hunt</w:t>
-              <w:br/>
-              <w:t>• Use visual cards for cultural game names and origins</w:t>
+              <w:rPr>
+                <w:rFonts w:ascii="Calibri" w:hAnsi="Calibri"/>
+                <w:b w:val="0"/>
+                <w:i w:val="0"/>
+                <w:color w:val="18242F"/>
+                <w:sz w:val="18"/>
+              </w:rPr>
+              <w:t>Defines PA; uses specific evidence; links valuing diversity to participation, belonging or wellbeing.</w:t>
             </w:r>
           </w:p>
         </w:tc>
         <w:tc>
           <w:tcPr>
-            <w:tcW w:type="dxa" w:w="4320"/>
+            <w:tcW w:type="dxa" w:w="3120"/>
           </w:tcPr>
           <w:p>
             <w:r>
-              <w:t>• Research an additional cultural activity independently</w:t>
-              <w:br/>
-              <w:t>• Compare participation barriers for different groups</w:t>
-              <w:br/>
-              <w:t>• Create a mini-poster promoting an inclusive school activity</w:t>
-              <w:br/>
-              <w:t>• Interview a family member about physical activity in their culture</w:t>
+              <w:rPr>
+                <w:rFonts w:ascii="Calibri" w:hAnsi="Calibri"/>
+                <w:b w:val="0"/>
+                <w:i w:val="0"/>
+                <w:color w:val="18242F"/>
+                <w:sz w:val="18"/>
+              </w:rPr>
+              <w:t>Gives a relevant example but the because link is general or evidence is incomplete.</w:t>
+            </w:r>
+          </w:p>
+        </w:tc>
+        <w:tc>
+          <w:tcPr>
+            <w:tcW w:type="dxa" w:w="3120"/>
+          </w:tcPr>
+          <w:p>
+            <w:r>
+              <w:rPr>
+                <w:rFonts w:ascii="Calibri" w:hAnsi="Calibri"/>
+                <w:b w:val="0"/>
+                <w:i w:val="0"/>
+                <w:color w:val="18242F"/>
+                <w:sz w:val="18"/>
+              </w:rPr>
+              <w:t>Lists different activities only; confuses diversity with wellbeing; makes an inaccurate cultural claim.</w:t>
             </w:r>
           </w:p>
         </w:tc>
       </w:tr>
     </w:tbl>
-    <w:p/>
-    <w:p>
-      <w:r>
-        <w:rPr>
-          <w:b/>
-          <w:sz w:val="24"/>
-        </w:rPr>
-        <w:t>Safety Notes</w:t>
-      </w:r>
-    </w:p>
     <w:p>
       <w:pPr>
-        <w:pStyle w:val="ListBullet"/>
+        <w:pStyle w:val="Heading1"/>
       </w:pPr>
       <w:r>
-        <w:t>Refer to Curriculum activities for risk management if conducting outdoor demonstrations</w:t>
-      </w:r>
-    </w:p>
-    <w:p>
-      <w:pPr>
-        <w:pStyle w:val="ListBullet"/>
-      </w:pPr>
-      <w:r>
-        <w:t>Ensure sun safety procedures if lesson moves outdoors</w:t>
-      </w:r>
-    </w:p>
-    <w:p>
-      <w:pPr>
-        <w:pStyle w:val="ListBullet"/>
-      </w:pPr>
-      <w:r>
-        <w:t>Ensure working environment is safe for any movement demonstrations</w:t>
-      </w:r>
-    </w:p>
-    <w:p/>
-    <w:p>
-      <w:r>
-        <w:rPr>
-          <w:b/>
-          <w:sz w:val="24"/>
-        </w:rPr>
-        <w:t>Teacher Reflection Notes</w:t>
+        <w:t>Source notes</w:t>
       </w:r>
     </w:p>
     <w:p>
       <w:r>
-        <w:t>What worked well?</w:t>
+        <w:rPr>
+          <w:rFonts w:ascii="Calibri" w:hAnsi="Calibri"/>
+          <w:b/>
+          <w:i w:val="0"/>
+          <w:color w:val="52606D"/>
+          <w:sz w:val="18"/>
+        </w:rPr>
+        <w:t xml:space="preserve">Australian Sports Commission: </w:t>
       </w:r>
+      <w:hyperlink r:id="rId12">
+        <w:r>
+          <w:rPr>
+            <w:color w:val="007C83"/>
+            <w:u w:val="single"/>
+          </w:rPr>
+          <w:t>Yulunga: Traditional Indigenous Games</w:t>
+        </w:r>
+      </w:hyperlink>
     </w:p>
     <w:p>
       <w:r>
-        <w:t>____________________________________________________________</w:t>
+        <w:rPr>
+          <w:rFonts w:ascii="Calibri" w:hAnsi="Calibri"/>
+          <w:b/>
+          <w:i w:val="0"/>
+          <w:color w:val="52606D"/>
+          <w:sz w:val="18"/>
+        </w:rPr>
+        <w:t xml:space="preserve">Australian Government: </w:t>
       </w:r>
+      <w:hyperlink r:id="rId11">
+        <w:r>
+          <w:rPr>
+            <w:color w:val="007C83"/>
+            <w:u w:val="single"/>
+          </w:rPr>
+          <w:t>About physical activity</w:t>
+        </w:r>
+      </w:hyperlink>
     </w:p>
     <w:p>
       <w:r>
-        <w:t>What would I change next time?</w:t>
+        <w:rPr>
+          <w:rFonts w:ascii="Calibri" w:hAnsi="Calibri"/>
+          <w:b/>
+          <w:i w:val="0"/>
+          <w:color w:val="52606D"/>
+          <w:sz w:val="18"/>
+        </w:rPr>
+        <w:t xml:space="preserve">National Center for Complementary and Integrative Health: </w:t>
       </w:r>
-    </w:p>
-    <w:p>
-      <w:r>
-        <w:t>____________________________________________________________</w:t>
-      </w:r>
+      <w:hyperlink r:id="rId13">
+        <w:r>
+          <w:rPr>
+            <w:color w:val="007C83"/>
+            <w:u w:val="single"/>
+          </w:rPr>
+          <w:t>Tai Chi: What You Need To Know</w:t>
+        </w:r>
+      </w:hyperlink>
     </w:p>
     <w:sectPr>
+      <w:headerReference w:type="default" r:id="rId9"/>
+      <w:footerReference w:type="default" r:id="rId10"/>
       <w:pgSz w:w="12240" w:h="15840"/>
-      <w:pgMar w:top="1440" w:right="1800" w:bottom="1440" w:left="1800" w:header="720" w:footer="720" w:gutter="0"/>
+      <w:pgMar w:top="1123" w:right="1440" w:bottom="1037" w:left="1440" w:header="461" w:footer="504" w:gutter="0"/>
       <w:cols w:space="720"/>
       <w:docGrid w:linePitch="360"/>
     </w:sectPr>
   </w:body>
 </w:document>
+</file>
+
+<file path=word/footer1.xml><?xml version="1.0" encoding="utf-8"?>
+<w:ftr xmlns:m="http://schemas.openxmlformats.org/officeDocument/2006/math" xmlns:mc="http://schemas.openxmlformats.org/markup-compatibility/2006" xmlns:mo="http://schemas.microsoft.com/office/mac/office/2008/main" xmlns:mv="urn:schemas-microsoft-com:mac:vml" xmlns:o="urn:schemas-microsoft-com:office:office" xmlns:r="http://schemas.openxmlformats.org/officeDocument/2006/relationships" xmlns:v="urn:schemas-microsoft-com:vml" xmlns:w10="urn:schemas-microsoft-com:office:word" xmlns:w14="http://schemas.microsoft.com/office/word/2010/wordml" xmlns:w="http://schemas.openxmlformats.org/wordprocessingml/2006/main" xmlns:wne="http://schemas.microsoft.com/office/word/2006/wordml" xmlns:wp14="http://schemas.microsoft.com/office/word/2010/wordprocessingDrawing" xmlns:wp="http://schemas.openxmlformats.org/drawingml/2006/wordprocessingDrawing" xmlns:wpc="http://schemas.microsoft.com/office/word/2010/wordprocessingCanvas" xmlns:wpg="http://schemas.microsoft.com/office/word/2010/wordprocessingGroup" xmlns:wpi="http://schemas.microsoft.com/office/word/2010/wordprocessingInk" xmlns:wps="http://schemas.microsoft.com/office/word/2010/wordprocessingShape" mc:Ignorable="w14 wp14">
+  <w:p>
+    <w:pPr>
+      <w:pStyle w:val="Footer"/>
+      <w:spacing w:before="0"/>
+      <w:jc w:val="center"/>
+    </w:pPr>
+    <w:r>
+      <w:rPr>
+        <w:rFonts w:ascii="Calibri" w:hAnsi="Calibri"/>
+        <w:b/>
+        <w:i w:val="0"/>
+        <w:color w:val="52606D"/>
+        <w:sz w:val="16"/>
+      </w:rPr>
+      <w:t>LET'S ALL BE ACTIVE  |  YEAR 6 HEALTH  |  WEEK 1</w:t>
+    </w:r>
+  </w:p>
+</w:ftr>
+</file>
+
+<file path=word/header1.xml><?xml version="1.0" encoding="utf-8"?>
+<w:hdr xmlns:m="http://schemas.openxmlformats.org/officeDocument/2006/math" xmlns:mc="http://schemas.openxmlformats.org/markup-compatibility/2006" xmlns:mo="http://schemas.microsoft.com/office/mac/office/2008/main" xmlns:mv="urn:schemas-microsoft-com:mac:vml" xmlns:o="urn:schemas-microsoft-com:office:office" xmlns:r="http://schemas.openxmlformats.org/officeDocument/2006/relationships" xmlns:v="urn:schemas-microsoft-com:vml" xmlns:w10="urn:schemas-microsoft-com:office:word" xmlns:w14="http://schemas.microsoft.com/office/word/2010/wordml" xmlns:w="http://schemas.openxmlformats.org/wordprocessingml/2006/main" xmlns:wne="http://schemas.microsoft.com/office/word/2006/wordml" xmlns:wp14="http://schemas.microsoft.com/office/word/2010/wordprocessingDrawing" xmlns:wp="http://schemas.openxmlformats.org/drawingml/2006/wordprocessingDrawing" xmlns:wpc="http://schemas.microsoft.com/office/word/2010/wordprocessingCanvas" xmlns:wpg="http://schemas.microsoft.com/office/word/2010/wordprocessingGroup" xmlns:wpi="http://schemas.microsoft.com/office/word/2010/wordprocessingInk" xmlns:wps="http://schemas.microsoft.com/office/word/2010/wordprocessingShape" mc:Ignorable="w14 wp14">
+  <w:p>
+    <w:pPr>
+      <w:pStyle w:val="Header"/>
+      <w:spacing w:after="0"/>
+      <w:jc w:val="right"/>
+    </w:pPr>
+    <w:r>
+      <w:rPr>
+        <w:rFonts w:ascii="Calibri" w:hAnsi="Calibri"/>
+        <w:b/>
+        <w:i w:val="0"/>
+        <w:color w:val="007C83"/>
+        <w:sz w:val="16"/>
+      </w:rPr>
+      <w:t>TEACHER PLAN</w:t>
+    </w:r>
+  </w:p>
+</w:hdr>
 </file>
 
 <file path=word/numbering.xml><?xml version="1.0" encoding="utf-8"?>
@@ -1297,6 +3149,14 @@
     <w:name w:val="Normal"/>
     <w:qFormat/>
     <w:rsid w:val="00FC693F"/>
+    <w:pPr>
+      <w:spacing w:after="120" w:line="276" w:lineRule="auto"/>
+    </w:pPr>
+    <w:rPr>
+      <w:rFonts w:ascii="Calibri" w:hAnsi="Calibri"/>
+      <w:color w:val="18242F"/>
+      <w:sz w:val="21"/>
+    </w:rPr>
   </w:style>
   <w:style w:type="paragraph" w:styleId="Header">
     <w:name w:val="header"/>
@@ -1353,15 +3213,15 @@
     <w:pPr>
       <w:keepNext/>
       <w:keepLines/>
-      <w:spacing w:before="480" w:after="0"/>
+      <w:spacing w:before="280" w:after="140"/>
       <w:outlineLvl w:val="0"/>
     </w:pPr>
     <w:rPr>
-      <w:rFonts w:asciiTheme="majorHAnsi" w:eastAsiaTheme="majorEastAsia" w:hAnsiTheme="majorHAnsi" w:cstheme="majorBidi"/>
+      <w:rFonts w:asciiTheme="majorHAnsi" w:eastAsiaTheme="majorEastAsia" w:hAnsiTheme="majorHAnsi" w:cstheme="majorBidi" w:ascii="Calibri" w:hAnsi="Calibri"/>
       <w:b/>
       <w:bCs/>
-      <w:color w:val="365F91" w:themeColor="accent1" w:themeShade="BF"/>
-      <w:sz w:val="28"/>
+      <w:color w:val="17324D"/>
+      <w:sz w:val="34"/>
       <w:szCs w:val="28"/>
     </w:rPr>
   </w:style>
@@ -1377,15 +3237,15 @@
     <w:pPr>
       <w:keepNext/>
       <w:keepLines/>
-      <w:spacing w:before="200" w:after="0"/>
+      <w:spacing w:before="220" w:after="100"/>
       <w:outlineLvl w:val="1"/>
     </w:pPr>
     <w:rPr>
-      <w:rFonts w:asciiTheme="majorHAnsi" w:eastAsiaTheme="majorEastAsia" w:hAnsiTheme="majorHAnsi" w:cstheme="majorBidi"/>
+      <w:rFonts w:asciiTheme="majorHAnsi" w:eastAsiaTheme="majorEastAsia" w:hAnsiTheme="majorHAnsi" w:cstheme="majorBidi" w:ascii="Calibri" w:hAnsi="Calibri"/>
       <w:b/>
       <w:bCs/>
-      <w:color w:val="4F81BD" w:themeColor="accent1"/>
-      <w:sz w:val="26"/>
+      <w:color w:val="007C83"/>
+      <w:sz w:val="27"/>
       <w:szCs w:val="26"/>
     </w:rPr>
   </w:style>
@@ -1401,14 +3261,15 @@
     <w:pPr>
       <w:keepNext/>
       <w:keepLines/>
-      <w:spacing w:before="200" w:after="0"/>
+      <w:spacing w:before="160" w:after="80"/>
       <w:outlineLvl w:val="2"/>
     </w:pPr>
     <w:rPr>
-      <w:rFonts w:asciiTheme="majorHAnsi" w:eastAsiaTheme="majorEastAsia" w:hAnsiTheme="majorHAnsi" w:cstheme="majorBidi"/>
+      <w:rFonts w:asciiTheme="majorHAnsi" w:eastAsiaTheme="majorEastAsia" w:hAnsiTheme="majorHAnsi" w:cstheme="majorBidi" w:ascii="Calibri" w:hAnsi="Calibri"/>
       <w:b/>
       <w:bCs/>
-      <w:color w:val="4F81BD" w:themeColor="accent1"/>
+      <w:color w:val="17324D"/>
+      <w:sz w:val="23"/>
     </w:rPr>
   </w:style>
   <w:style w:type="paragraph" w:styleId="Heading4">
@@ -1639,18 +3500,20 @@
     <w:qFormat/>
     <w:rsid w:val="00FC693F"/>
     <w:pPr>
+      <w:keepNext/>
       <w:pBdr>
         <w:bottom w:val="single" w:sz="8" w:space="4" w:color="4F81BD" w:themeColor="accent1"/>
       </w:pBdr>
-      <w:spacing w:after="300" w:line="240" w:lineRule="auto"/>
+      <w:spacing w:after="100" w:line="240" w:lineRule="auto" w:before="0"/>
       <w:contextualSpacing/>
     </w:pPr>
     <w:rPr>
-      <w:rFonts w:asciiTheme="majorHAnsi" w:eastAsiaTheme="majorEastAsia" w:hAnsiTheme="majorHAnsi" w:cstheme="majorBidi"/>
-      <w:color w:val="17365D" w:themeColor="text2" w:themeShade="BF"/>
+      <w:rFonts w:asciiTheme="majorHAnsi" w:eastAsiaTheme="majorEastAsia" w:hAnsiTheme="majorHAnsi" w:cstheme="majorBidi" w:ascii="Calibri" w:hAnsi="Calibri"/>
+      <w:b/>
+      <w:color w:val="17324D"/>
       <w:spacing w:val="5"/>
       <w:kern w:val="28"/>
-      <w:sz w:val="52"/>
+      <w:sz w:val="54"/>
       <w:szCs w:val="52"/>
     </w:rPr>
   </w:style>
@@ -1678,17 +3541,20 @@
     <w:qFormat/>
     <w:rsid w:val="00FC693F"/>
     <w:pPr>
+      <w:keepNext/>
       <w:numPr>
         <w:ilvl w:val="1"/>
       </w:numPr>
+      <w:spacing w:before="0" w:after="280"/>
     </w:pPr>
     <w:rPr>
-      <w:rFonts w:asciiTheme="majorHAnsi" w:eastAsiaTheme="majorEastAsia" w:hAnsiTheme="majorHAnsi" w:cstheme="majorBidi"/>
+      <w:rFonts w:asciiTheme="majorHAnsi" w:eastAsiaTheme="majorEastAsia" w:hAnsiTheme="majorHAnsi" w:cstheme="majorBidi" w:ascii="Calibri" w:hAnsi="Calibri"/>
+      <w:b w:val="0"/>
       <w:i/>
       <w:iCs/>
-      <w:color w:val="4F81BD" w:themeColor="accent1"/>
+      <w:color w:val="52606D"/>
       <w:spacing w:val="15"/>
-      <w:sz w:val="24"/>
+      <w:sz w:val="26"/>
       <w:szCs w:val="24"/>
     </w:rPr>
   </w:style>

</xml_diff>